<commit_message>
Paso vente y siete Oscar Salas
</commit_message>
<xml_diff>
--- a/PILi_Quarts_V3.0/backend/modules/N04_Binary_Factory/output_sandbox/STUDIO_COTIZACION_COMPLEJA.docx
+++ b/PILi_Quarts_V3.0/backend/modules/N04_Binary_Factory/output_sandbox/STUDIO_COTIZACION_COMPLEJA.docx
@@ -3,22 +3,565 @@
 <w:document xmlns:wpc="http://schemas.microsoft.com/office/word/2010/wordprocessingCanvas" xmlns:mo="http://schemas.microsoft.com/office/mac/office/2008/main" xmlns:mc="http://schemas.openxmlformats.org/markup-compatibility/2006" xmlns:mv="urn:schemas-microsoft-com:mac:vml" xmlns:o="urn:schemas-microsoft-com:office:office" xmlns:r="http://schemas.openxmlformats.org/officeDocument/2006/relationships" xmlns:m="http://schemas.openxmlformats.org/officeDocument/2006/math" xmlns:v="urn:schemas-microsoft-com:vml" xmlns:wp14="http://schemas.microsoft.com/office/word/2010/wordprocessingDrawing" xmlns:wp="http://schemas.openxmlformats.org/drawingml/2006/wordprocessingDrawing" xmlns:w10="urn:schemas-microsoft-com:office:word" xmlns:w="http://schemas.openxmlformats.org/wordprocessingml/2006/main" xmlns:w14="http://schemas.microsoft.com/office/word/2010/wordml" xmlns:wpg="http://schemas.microsoft.com/office/word/2010/wordprocessingGroup" xmlns:wpi="http://schemas.microsoft.com/office/word/2010/wordprocessingInk" xmlns:wne="http://schemas.microsoft.com/office/word/2006/wordml" xmlns:wps="http://schemas.microsoft.com/office/word/2010/wordprocessingShape" mc:Ignorable="w14 wp14">
   <w:body>
     <w:p>
+      <w:r/>
+      <w:r/>
+    </w:p>
+    <w:p>
+      <w:r/>
+      <w:r/>
+      <w:r/>
+      <w:r/>
+      <w:r/>
+      <w:r/>
+      <w:r/>
+      <w:r/>
       <w:r>
+        <w:t>PILI</w:t>
+      </w:r>
+      <w:r/>
+      <w:r/>
+      <w:r/>
+      <w:r/>
+      <w:r/>
+      <w:r>
+        <w:t>TU EMPRESA S.A.C.</w:t>
+      </w:r>
+      <w:r/>
+      <w:r>
+        <w:t xml:space="preserve">RUC: </w:t>
+      </w:r>
+      <w:r>
+        <w:t>20123456789</w:t>
         <w:br/>
       </w:r>
+      <w:r/>
+      <w:r>
+        <w:t>Av. Tecnología 123, Lima</w:t>
+        <w:br/>
+      </w:r>
+      <w:r>
+        <w:t xml:space="preserve">Email: </w:t>
+      </w:r>
+      <w:r>
+        <w:t>contacto@empresa.com</w:t>
+      </w:r>
+      <w:r>
+        <w:t xml:space="preserve"> | Tel: </w:t>
+      </w:r>
+      <w:r>
+        <w:t>000 000 000</w:t>
+      </w:r>
+      <w:r/>
+      <w:r/>
+      <w:r/>
+      <w:r/>
+      <w:r/>
+      <w:r/>
     </w:p>
     <w:p>
       <w:pPr>
-        <w:pStyle w:val="Title"/>
-        <w:jc w:val="center"/>
+        <w:pStyle w:val="Heading1"/>
       </w:pPr>
       <w:r>
-        <w:t>{{ TITULO_DOCUMENTO }}</w:t>
+        <w:t>COTIZACION COMPLEJA</w:t>
       </w:r>
+      <w:r/>
+    </w:p>
+    <w:p>
+      <w:r/>
+      <w:r>
+        <w:t>Servicios de Ingeniería Especializada</w:t>
+      </w:r>
+      <w:r/>
+    </w:p>
+    <w:p>
+      <w:r/>
+      <w:r>
+        <w:t>N° N04-SOL-2026-045 | Fecha: 24/02/2026</w:t>
+      </w:r>
+      <w:r/>
+      <w:r/>
+      <w:r/>
+      <w:r/>
+      <w:r/>
+      <w:r>
+        <w:t>DATOS DEL CLIENTE</w:t>
+      </w:r>
+      <w:r/>
+      <w:r>
+        <w:t>Empresa:</w:t>
+      </w:r>
+      <w:r>
+        <w:t xml:space="preserve"> </w:t>
+      </w:r>
+      <w:r>
+        <w:t>INDUSTRIAL SOLUTIONS PERÚ S.A.</w:t>
+      </w:r>
+      <w:r/>
+      <w:r>
+        <w:t>RUC/ID:</w:t>
+      </w:r>
+      <w:r>
+        <w:t xml:space="preserve"> </w:t>
+      </w:r>
+      <w:r>
+        <w:t>20555666777</w:t>
+      </w:r>
+      <w:r/>
+      <w:r>
+        <w:t>Dirección:</w:t>
+      </w:r>
+      <w:r>
+        <w:t xml:space="preserve"> </w:t>
+      </w:r>
+      <w:r>
+        <w:t>Parque Industrial Lote 45, Lurín</w:t>
+      </w:r>
+      <w:r/>
+      <w:r>
+        <w:t>Solicitado:</w:t>
+      </w:r>
+      <w:r>
+        <w:t xml:space="preserve"> </w:t>
+      </w:r>
+      <w:r>
+        <w:t>gerencia@industrial.com</w:t>
+      </w:r>
+      <w:r/>
+      <w:r/>
+      <w:r/>
+      <w:r>
+        <w:t>RESUMEN EJECUTIVO</w:t>
+      </w:r>
+      <w:r/>
+      <w:r>
+        <w:t>Proyecto:</w:t>
+      </w:r>
+      <w:r>
+        <w:t xml:space="preserve"> </w:t>
+      </w:r>
+      <w:r>
+        <w:t>SISTEMA DE AUTOMATIZACIÓN Y CONTROL Q3</w:t>
+      </w:r>
+      <w:r/>
+      <w:r>
+        <w:t>Validez:</w:t>
+      </w:r>
+      <w:r>
+        <w:t xml:space="preserve"> </w:t>
+      </w:r>
+      <w:r>
+        <w:t>15 días calendario</w:t>
+      </w:r>
+      <w:r/>
+      <w:r>
+        <w:t>Moneda:</w:t>
+      </w:r>
+      <w:r>
+        <w:t xml:space="preserve"> </w:t>
+      </w:r>
+      <w:r>
+        <w:t>Soles (S/)</w:t>
+      </w:r>
+      <w:r/>
+      <w:r/>
+      <w:r/>
+      <w:r/>
+      <w:r/>
+      <w:r/>
+      <w:r/>
+    </w:p>
+    <w:p>
+      <w:pPr>
+        <w:pStyle w:val="Heading3"/>
+      </w:pPr>
+      <w:r>
+        <w:t>Información del Solicitante</w:t>
+      </w:r>
+      <w:r/>
+      <w:r/>
+    </w:p>
+    <w:p>
+      <w:r/>
+      <w:r>
+        <w:rPr>
+          <w:b/>
+        </w:rPr>
+        <w:t>Empresa:</w:t>
+      </w:r>
+      <w:r>
+        <w:t xml:space="preserve"> </w:t>
+      </w:r>
+      <w:r>
+        <w:t>INDUSTRIAL SOLUTIONS PERÚ S.A.</w:t>
+      </w:r>
+      <w:r/>
+    </w:p>
+    <w:p>
+      <w:r/>
+      <w:r>
+        <w:rPr>
+          <w:b/>
+        </w:rPr>
+        <w:t>ID/RUC:</w:t>
+      </w:r>
+      <w:r>
+        <w:t xml:space="preserve"> </w:t>
+      </w:r>
+      <w:r>
+        <w:t>20555666777</w:t>
+      </w:r>
+      <w:r/>
+    </w:p>
+    <w:p>
+      <w:r/>
+      <w:r>
+        <w:rPr>
+          <w:b/>
+        </w:rPr>
+        <w:t>Ubicación:</w:t>
+      </w:r>
+      <w:r>
+        <w:t xml:space="preserve"> </w:t>
+      </w:r>
+      <w:r>
+        <w:t>Parque Industrial Lote 45, Lurín</w:t>
+      </w:r>
+      <w:r/>
+    </w:p>
+    <w:p>
+      <w:r/>
+      <w:r>
+        <w:rPr>
+          <w:b/>
+        </w:rPr>
+        <w:t>Email:</w:t>
+      </w:r>
+      <w:r>
+        <w:t xml:space="preserve"> </w:t>
+      </w:r>
+      <w:r>
+        <w:t>gerencia@industrial.com</w:t>
+      </w:r>
+      <w:r/>
+      <w:r/>
+      <w:r/>
+      <w:r/>
+    </w:p>
+    <w:p>
+      <w:pPr>
+        <w:pStyle w:val="Heading3"/>
+      </w:pPr>
+      <w:r>
+        <w:t>Resumen del Proyecto</w:t>
+      </w:r>
+      <w:r/>
+      <w:r/>
+    </w:p>
+    <w:p>
+      <w:r/>
+      <w:r>
+        <w:rPr>
+          <w:b/>
+        </w:rPr>
+        <w:t>Alcance:</w:t>
+      </w:r>
+      <w:r>
+        <w:t xml:space="preserve"> </w:t>
+      </w:r>
+      <w:r>
+        <w:t>SISTEMA DE AUTOMATIZACIÓN Y CONTROL Q3</w:t>
+      </w:r>
+      <w:r/>
+    </w:p>
+    <w:p>
+      <w:r/>
+      <w:r>
+        <w:rPr>
+          <w:b/>
+        </w:rPr>
+        <w:t>Validez:</w:t>
+      </w:r>
+      <w:r>
+        <w:t xml:space="preserve"> </w:t>
+      </w:r>
+      <w:r>
+        <w:t>15 días calendario</w:t>
+      </w:r>
+      <w:r>
+        <w:t xml:space="preserve"> días calendario</w:t>
+      </w:r>
+      <w:r/>
+      <w:r/>
+      <w:r/>
+      <w:r/>
+      <w:r/>
+    </w:p>
+    <w:p>
+      <w:pPr>
+        <w:jc w:val="both"/>
+      </w:pPr>
+      <w:r/>
+      <w:r>
+        <w:t>Presentamos la siguiente propuesta técnica-económica diseñada para satisfacer los requerimientos específicos de su organización, garantizando los más altos estándares de calidad y seguridad industrial.</w:t>
+      </w:r>
+      <w:r/>
+      <w:r/>
+      <w:r/>
+      <w:r>
+        <w:t>DESGLOSE DE SUMINISTROS Y SERVICIOS</w:t>
+      </w:r>
+      <w:r/>
     </w:p>
     <w:tbl>
       <w:tblPr>
-        <w:tblStyle w:val="TableGrid"/>
+        <w:tblW w:type="auto" w:w="0"/>
+        <w:tblLook w:firstColumn="1" w:firstRow="1" w:lastColumn="0" w:lastRow="0" w:noHBand="0" w:noVBand="1" w:val="04A0"/>
+      </w:tblPr>
+      <w:tblGrid>
+        <w:gridCol w:w="1728"/>
+        <w:gridCol w:w="1728"/>
+        <w:gridCol w:w="1728"/>
+        <w:gridCol w:w="1728"/>
+        <w:gridCol w:w="1728"/>
+      </w:tblGrid>
+      <w:tr>
+        <w:tc>
+          <w:tcPr>
+            <w:tcW w:type="dxa" w:w="1728"/>
+          </w:tcPr>
+          <w:p>
+            <w:r>
+              <w:rPr>
+                <w:b/>
+              </w:rPr>
+              <w:t>Ítem</w:t>
+            </w:r>
+          </w:p>
+        </w:tc>
+        <w:tc>
+          <w:tcPr>
+            <w:tcW w:type="dxa" w:w="1728"/>
+          </w:tcPr>
+          <w:p>
+            <w:r>
+              <w:rPr>
+                <w:b/>
+              </w:rPr>
+              <w:t>Descripción Detallada</w:t>
+            </w:r>
+          </w:p>
+        </w:tc>
+        <w:tc>
+          <w:tcPr>
+            <w:tcW w:type="dxa" w:w="1728"/>
+          </w:tcPr>
+          <w:p>
+            <w:r>
+              <w:rPr>
+                <w:b/>
+              </w:rPr>
+              <w:t>Cant.</w:t>
+            </w:r>
+          </w:p>
+        </w:tc>
+        <w:tc>
+          <w:tcPr>
+            <w:tcW w:type="dxa" w:w="1728"/>
+          </w:tcPr>
+          <w:p>
+            <w:r>
+              <w:rPr>
+                <w:b/>
+              </w:rPr>
+              <w:t>Und.</w:t>
+            </w:r>
+          </w:p>
+        </w:tc>
+        <w:tc>
+          <w:tcPr>
+            <w:tcW w:type="dxa" w:w="1728"/>
+          </w:tcPr>
+          <w:p>
+            <w:r>
+              <w:rPr>
+                <w:b/>
+              </w:rPr>
+              <w:t>Total</w:t>
+            </w:r>
+          </w:p>
+        </w:tc>
+      </w:tr>
+      <w:tr>
+        <w:tc>
+          <w:tcPr>
+            <w:tcW w:type="dxa" w:w="1728"/>
+          </w:tcPr>
+          <w:p>
+            <w:r>
+              <w:t>01</w:t>
+            </w:r>
+          </w:p>
+        </w:tc>
+        <w:tc>
+          <w:tcPr>
+            <w:tcW w:type="dxa" w:w="1728"/>
+          </w:tcPr>
+          <w:p>
+            <w:r/>
+            <w:r>
+              <w:t>Controlador PLC Siemens S7-1200</w:t>
+            </w:r>
+            <w:r/>
+          </w:p>
+        </w:tc>
+        <w:tc>
+          <w:tcPr>
+            <w:tcW w:type="dxa" w:w="1728"/>
+          </w:tcPr>
+          <w:p>
+            <w:r>
+              <w:t>1</w:t>
+            </w:r>
+          </w:p>
+        </w:tc>
+        <w:tc>
+          <w:tcPr>
+            <w:tcW w:type="dxa" w:w="1728"/>
+          </w:tcPr>
+          <w:p>
+            <w:r>
+              <w:t>und</w:t>
+            </w:r>
+          </w:p>
+        </w:tc>
+        <w:tc>
+          <w:tcPr>
+            <w:tcW w:type="dxa" w:w="1728"/>
+          </w:tcPr>
+          <w:p>
+            <w:r>
+              <w:t>S/ 1,250.00</w:t>
+            </w:r>
+          </w:p>
+        </w:tc>
+      </w:tr>
+      <w:tr>
+        <w:tc>
+          <w:tcPr>
+            <w:tcW w:type="dxa" w:w="1728"/>
+          </w:tcPr>
+          <w:p>
+            <w:r>
+              <w:t>02</w:t>
+            </w:r>
+          </w:p>
+        </w:tc>
+        <w:tc>
+          <w:tcPr>
+            <w:tcW w:type="dxa" w:w="1728"/>
+          </w:tcPr>
+          <w:p>
+            <w:r/>
+            <w:r>
+              <w:t>Licencia TIA Portal V17 Premium</w:t>
+            </w:r>
+            <w:r/>
+          </w:p>
+        </w:tc>
+        <w:tc>
+          <w:tcPr>
+            <w:tcW w:type="dxa" w:w="1728"/>
+          </w:tcPr>
+          <w:p>
+            <w:r>
+              <w:t>1</w:t>
+            </w:r>
+          </w:p>
+        </w:tc>
+        <w:tc>
+          <w:tcPr>
+            <w:tcW w:type="dxa" w:w="1728"/>
+          </w:tcPr>
+          <w:p>
+            <w:r>
+              <w:t>srv</w:t>
+            </w:r>
+          </w:p>
+        </w:tc>
+        <w:tc>
+          <w:tcPr>
+            <w:tcW w:type="dxa" w:w="1728"/>
+          </w:tcPr>
+          <w:p>
+            <w:r>
+              <w:t>S/ 800.00</w:t>
+            </w:r>
+          </w:p>
+        </w:tc>
+      </w:tr>
+      <w:tr>
+        <w:tc>
+          <w:tcPr>
+            <w:tcW w:type="dxa" w:w="1728"/>
+          </w:tcPr>
+          <w:p>
+            <w:r>
+              <w:t>03</w:t>
+            </w:r>
+          </w:p>
+        </w:tc>
+        <w:tc>
+          <w:tcPr>
+            <w:tcW w:type="dxa" w:w="1728"/>
+          </w:tcPr>
+          <w:p>
+            <w:r/>
+            <w:r>
+              <w:t>Instalación y Configuración en Planta</w:t>
+            </w:r>
+            <w:r/>
+          </w:p>
+        </w:tc>
+        <w:tc>
+          <w:tcPr>
+            <w:tcW w:type="dxa" w:w="1728"/>
+          </w:tcPr>
+          <w:p>
+            <w:r>
+              <w:t>1</w:t>
+            </w:r>
+          </w:p>
+        </w:tc>
+        <w:tc>
+          <w:tcPr>
+            <w:tcW w:type="dxa" w:w="1728"/>
+          </w:tcPr>
+          <w:p>
+            <w:r>
+              <w:t>glob</w:t>
+            </w:r>
+          </w:p>
+        </w:tc>
+        <w:tc>
+          <w:tcPr>
+            <w:tcW w:type="dxa" w:w="1728"/>
+          </w:tcPr>
+          <w:p>
+            <w:r>
+              <w:t>S/ 2,500.00</w:t>
+            </w:r>
+          </w:p>
+        </w:tc>
+      </w:tr>
+    </w:tbl>
+    <w:p>
+      <w:r/>
+      <w:r/>
+      <w:r/>
+    </w:p>
+    <w:tbl>
+      <w:tblPr>
         <w:tblW w:type="auto" w:w="0"/>
         <w:tblLook w:firstColumn="1" w:firstRow="1" w:lastColumn="0" w:lastRow="0" w:noHBand="0" w:noVBand="1" w:val="04A0"/>
       </w:tblPr>
@@ -33,7 +576,10 @@
           </w:tcPr>
           <w:p>
             <w:r>
-              <w:t>CLIENTE:</w:t>
+              <w:rPr>
+                <w:b/>
+              </w:rPr>
+              <w:t>Subtotal:</w:t>
             </w:r>
           </w:p>
         </w:tc>
@@ -43,7 +589,7 @@
           </w:tcPr>
           <w:p>
             <w:r>
-              <w:t>{{ CLIENTE_NOMBRE }}</w:t>
+              <w:t>S/ 4,550.00</w:t>
             </w:r>
           </w:p>
         </w:tc>
@@ -55,7 +601,10 @@
           </w:tcPr>
           <w:p>
             <w:r>
-              <w:t>PROYECTO:</w:t>
+              <w:rPr>
+                <w:b/>
+              </w:rPr>
+              <w:t>IGV (18%):</w:t>
             </w:r>
           </w:p>
         </w:tc>
@@ -65,7 +614,7 @@
           </w:tcPr>
           <w:p>
             <w:r>
-              <w:t>{{ PROYECTO_NOMBRE }}</w:t>
+              <w:t>S/ 819.00</w:t>
             </w:r>
           </w:p>
         </w:tc>
@@ -77,7 +626,10 @@
           </w:tcPr>
           <w:p>
             <w:r>
-              <w:t>FECHA:</w:t>
+              <w:rPr>
+                <w:b/>
+              </w:rPr>
+              <w:t>TOTAL:</w:t>
             </w:r>
           </w:p>
         </w:tc>
@@ -87,368 +639,13 @@
           </w:tcPr>
           <w:p>
             <w:r>
-              <w:t>{{ FECHA }}</w:t>
+              <w:t>S/ 5,369.00</w:t>
             </w:r>
           </w:p>
         </w:tc>
       </w:tr>
     </w:tbl>
     <w:p>
-      <w:r>
-        <w:br/>
-      </w:r>
-    </w:p>
-    <w:p>
-      <w:pPr>
-        <w:pStyle w:val="Heading2"/>
-      </w:pPr>
-      <w:r>
-        <w:t>Detalle de Items</w:t>
-      </w:r>
-    </w:p>
-    <w:tbl>
-      <w:tblPr>
-        <w:tblStyle w:val="TableGrid"/>
-        <w:tblW w:type="auto" w:w="0"/>
-        <w:tblLook w:firstColumn="1" w:firstRow="1" w:lastColumn="0" w:lastRow="0" w:noHBand="0" w:noVBand="1" w:val="04A0"/>
-      </w:tblPr>
-      <w:tblGrid>
-        <w:gridCol w:w="1440"/>
-        <w:gridCol w:w="1440"/>
-        <w:gridCol w:w="1440"/>
-        <w:gridCol w:w="1440"/>
-        <w:gridCol w:w="1440"/>
-        <w:gridCol w:w="1440"/>
-      </w:tblGrid>
-      <w:tr>
-        <w:tc>
-          <w:tcPr>
-            <w:tcW w:type="dxa" w:w="1440"/>
-          </w:tcPr>
-          <w:p>
-            <w:r>
-              <w:t>ITEM</w:t>
-            </w:r>
-          </w:p>
-        </w:tc>
-        <w:tc>
-          <w:tcPr>
-            <w:tcW w:type="dxa" w:w="1440"/>
-          </w:tcPr>
-          <w:p>
-            <w:r>
-              <w:t>DESCRIPCIÓN</w:t>
-            </w:r>
-          </w:p>
-        </w:tc>
-        <w:tc>
-          <w:tcPr>
-            <w:tcW w:type="dxa" w:w="1440"/>
-          </w:tcPr>
-          <w:p>
-            <w:r>
-              <w:t>UNIDAD</w:t>
-            </w:r>
-          </w:p>
-        </w:tc>
-        <w:tc>
-          <w:tcPr>
-            <w:tcW w:type="dxa" w:w="1440"/>
-          </w:tcPr>
-          <w:p>
-            <w:r>
-              <w:t>CANT.</w:t>
-            </w:r>
-          </w:p>
-        </w:tc>
-        <w:tc>
-          <w:tcPr>
-            <w:tcW w:type="dxa" w:w="1440"/>
-          </w:tcPr>
-          <w:p>
-            <w:r>
-              <w:t>P.UNIT</w:t>
-            </w:r>
-          </w:p>
-        </w:tc>
-        <w:tc>
-          <w:tcPr>
-            <w:tcW w:type="dxa" w:w="1440"/>
-          </w:tcPr>
-          <w:p>
-            <w:r>
-              <w:t>TOTAL</w:t>
-            </w:r>
-          </w:p>
-        </w:tc>
-      </w:tr>
-      <w:tr>
-        <w:tc>
-          <w:tcPr>
-            <w:tcW w:type="dxa" w:w="1440"/>
-          </w:tcPr>
-          <w:p>
-            <w:r/>
-            <w:r>
-              <w:rPr>
-                <w:sz w:val="2"/>
-              </w:rPr>
-              <w:t>{% for item in items %}</w:t>
-            </w:r>
-            <w:r>
-              <w:t>{{ item.index }}</w:t>
-            </w:r>
-          </w:p>
-        </w:tc>
-        <w:tc>
-          <w:tcPr>
-            <w:tcW w:type="dxa" w:w="1440"/>
-          </w:tcPr>
-          <w:p>
-            <w:r>
-              <w:t>{{ item.descripcion }}</w:t>
-            </w:r>
-          </w:p>
-        </w:tc>
-        <w:tc>
-          <w:tcPr>
-            <w:tcW w:type="dxa" w:w="1440"/>
-          </w:tcPr>
-          <w:p>
-            <w:r>
-              <w:t>{{ item.unidad }}</w:t>
-            </w:r>
-          </w:p>
-        </w:tc>
-        <w:tc>
-          <w:tcPr>
-            <w:tcW w:type="dxa" w:w="1440"/>
-          </w:tcPr>
-          <w:p>
-            <w:r>
-              <w:t>{{ item.cantidad }}</w:t>
-            </w:r>
-          </w:p>
-        </w:tc>
-        <w:tc>
-          <w:tcPr>
-            <w:tcW w:type="dxa" w:w="1440"/>
-          </w:tcPr>
-          <w:p>
-            <w:r>
-              <w:t>{{ item.precio }}</w:t>
-            </w:r>
-          </w:p>
-        </w:tc>
-        <w:tc>
-          <w:tcPr>
-            <w:tcW w:type="dxa" w:w="1440"/>
-          </w:tcPr>
-          <w:p>
-            <w:r>
-              <w:t>{{ item.total }}</w:t>
-            </w:r>
-            <w:r>
-              <w:t>{% endfor %}</w:t>
-            </w:r>
-          </w:p>
-        </w:tc>
-      </w:tr>
-    </w:tbl>
-    <w:p>
-      <w:r>
-        <w:br/>
-      </w:r>
-    </w:p>
-    <w:p>
-      <w:pPr>
-        <w:jc w:val="right"/>
-      </w:pPr>
-      <w:r>
-        <w:rPr>
-          <w:b/>
-        </w:rPr>
-        <w:t>SUBTOTAL: {{ SUBTOTAL }}</w:t>
-        <w:br/>
-      </w:r>
-      <w:r>
-        <w:rPr>
-          <w:b/>
-        </w:rPr>
-        <w:t>IGV (18%): {{ IGV }}</w:t>
-        <w:br/>
-      </w:r>
-      <w:r>
-        <w:rPr>
-          <w:b/>
-        </w:rPr>
-        <w:t>TOTAL: {{ TOTAL }}</w:t>
-      </w:r>
-    </w:p>
-    <w:p>
-      <w:pPr>
-        <w:sectPr>
-          <w:headerReference w:type="default" r:id="rId9"/>
-          <w:footerReference w:type="default" r:id="rId10"/>
-          <w:pgSz w:w="12240" w:h="15840"/>
-          <w:pgMar w:top="1440" w:right="1800" w:bottom="1440" w:left="1800" w:header="720" w:footer="720" w:gutter="0"/>
-          <w:cols w:space="720"/>
-          <w:docGrid w:linePitch="360"/>
-        </w:sectPr>
-      </w:pPr>
-    </w:p>
-    <w:p>
-      <w:r/>
-      <w:r/>
-    </w:p>
-    <w:p>
-      <w:r/>
-      <w:r/>
-      <w:r/>
-      <w:r/>
-      <w:r/>
-      <w:r/>
-      <w:r>
-        <w:t>TESLA</w:t>
-      </w:r>
-      <w:r/>
-    </w:p>
-    <w:p>
-      <w:r/>
-      <w:r>
-        <w:t>Electricidad y Automatización</w:t>
-      </w:r>
-      <w:r/>
-      <w:r/>
-      <w:r/>
-      <w:r>
-        <w:t>TESLA ELECTRICIDAD Y AUTOMATIZACIÓN S.A.C.</w:t>
-      </w:r>
-      <w:r/>
-      <w:r/>
-      <w:r>
-        <w:t>RUC: 20601138787</w:t>
-      </w:r>
-      <w:r/>
-      <w:r>
-        <w:t>Jr. Las Ágatas Mz B Lote 09, Urb. San Carlos, SJL</w:t>
-      </w:r>
-      <w:r/>
-      <w:r>
-        <w:t>Teléfono: 906 315 961</w:t>
-      </w:r>
-      <w:r/>
-      <w:r>
-        <w:t>Email: ingenieria.teslaelectricidad@gmail.com</w:t>
-      </w:r>
-      <w:r/>
-      <w:r/>
-      <w:r/>
-      <w:r/>
-      <w:r/>
-      <w:r/>
-    </w:p>
-    <w:p>
-      <w:pPr>
-        <w:pStyle w:val="Heading1"/>
-      </w:pPr>
-      <w:r>
-        <w:t>COTIZACIÓN PROFESIONAL</w:t>
-      </w:r>
-      <w:r/>
-      <w:r>
-        <w:t>Versión Completa con Ingeniería de Detalle</w:t>
-      </w:r>
-      <w:r/>
-      <w:r>
-        <w:t>N° {{ numero_cotizacion }}</w:t>
-      </w:r>
-      <w:r/>
-      <w:r/>
-      <w:r/>
-      <w:r/>
-      <w:r/>
-    </w:p>
-    <w:p>
-      <w:pPr>
-        <w:pStyle w:val="Heading3"/>
-      </w:pPr>
-      <w:r>
-        <w:t>Datos del Cliente</w:t>
-      </w:r>
-      <w:r/>
-    </w:p>
-    <w:p>
-      <w:r/>
-      <w:r>
-        <w:t>Cliente:</w:t>
-      </w:r>
-      <w:r>
-        <w:t xml:space="preserve"> {{ cliente_nombre }}</w:t>
-      </w:r>
-      <w:r/>
-    </w:p>
-    <w:p>
-      <w:r/>
-      <w:r>
-        <w:t>Proyecto:</w:t>
-      </w:r>
-      <w:r>
-        <w:t xml:space="preserve"> {{ proyecto_nombre }}</w:t>
-      </w:r>
-      <w:r/>
-    </w:p>
-    <w:p>
-      <w:r/>
-      <w:r>
-        <w:t>Área:</w:t>
-      </w:r>
-      <w:r>
-        <w:t xml:space="preserve"> {{ area_m2 }} m²</w:t>
-      </w:r>
-      <w:r/>
-      <w:r/>
-      <w:r/>
-    </w:p>
-    <w:p>
-      <w:pPr>
-        <w:pStyle w:val="Heading3"/>
-      </w:pPr>
-      <w:r>
-        <w:t>Datos de la Cotización</w:t>
-      </w:r>
-      <w:r/>
-    </w:p>
-    <w:p>
-      <w:r/>
-      <w:r>
-        <w:t>Fecha:</w:t>
-      </w:r>
-      <w:r>
-        <w:t xml:space="preserve"> {{ fecha_cotizacion }}</w:t>
-      </w:r>
-      <w:r/>
-    </w:p>
-    <w:p>
-      <w:r/>
-      <w:r>
-        <w:t>Vigencia:</w:t>
-      </w:r>
-      <w:r>
-        <w:t xml:space="preserve"> {{ vigencia }}</w:t>
-      </w:r>
-      <w:r/>
-    </w:p>
-    <w:p>
-      <w:r/>
-      <w:r>
-        <w:t>Servicio:</w:t>
-      </w:r>
-      <w:r>
-        <w:t xml:space="preserve"> {{ servicio_nombre }}</w:t>
-      </w:r>
-      <w:r/>
-      <w:r/>
       <w:r/>
       <w:r/>
       <w:r/>
@@ -458,20 +655,7 @@
         <w:pStyle w:val="Heading2"/>
       </w:pPr>
       <w:r>
-        <w:t>Alcance del Proyecto</w:t>
-      </w:r>
-      <w:r/>
-      <w:r>
-        <w:t>{{ descripcion_proyecto }}</w:t>
-      </w:r>
-    </w:p>
-    <w:p>
-      <w:r/>
-      <w:r>
-        <w:rPr>
-          <w:b/>
-        </w:rPr>
-        <w:t>INCLUYE:</w:t>
+        <w:t>ENTREGABLES Y GARANTÍAS</w:t>
       </w:r>
       <w:r/>
       <w:r/>
@@ -484,7 +668,7 @@
       </w:pPr>
       <w:r/>
       <w:r>
-        <w:t>Ingeniería de detalle con cálculos según {{ normativa_aplicable }}</w:t>
+        <w:t>Planos Eléctricos en AutoCAD v2026</w:t>
       </w:r>
       <w:r/>
     </w:p>
@@ -496,7 +680,7 @@
       </w:pPr>
       <w:r/>
       <w:r>
-        <w:t>Suministro de materiales de primera calidad</w:t>
+        <w:t>Manuales de Operación y Mantenimiento</w:t>
       </w:r>
       <w:r/>
     </w:p>
@@ -508,7 +692,7 @@
       </w:pPr>
       <w:r/>
       <w:r>
-        <w:t>Instalación por personal técnico certificado</w:t>
+        <w:t>Protocolos de Pruebas de Funcionamiento (FAT/SAT)</w:t>
       </w:r>
       <w:r/>
     </w:p>
@@ -520,7 +704,7 @@
       </w:pPr>
       <w:r/>
       <w:r>
-        <w:t>Pruebas y puesta en marcha</w:t>
+        <w:t>Garantía técnica de 12 meses contra defectos de fábrica.</w:t>
       </w:r>
       <w:r/>
     </w:p>
@@ -529,22 +713,34 @@
         <w:pStyle w:val="ListBullet"/>
         <w:spacing w:line="240" w:lineRule="auto"/>
         <w:ind w:left="720"/>
+        <w:jc w:val="right"/>
       </w:pPr>
       <w:r/>
       <w:r>
-        <w:t>Documentación técnica completa</w:t>
+        <w:t>Soporte técnico preferencial durante los primeros 90 días.</w:t>
       </w:r>
       <w:r/>
-    </w:p>
-    <w:p>
-      <w:pPr>
-        <w:pStyle w:val="ListBullet"/>
-        <w:spacing w:line="240" w:lineRule="auto"/>
-        <w:ind w:left="720"/>
-      </w:pPr>
+      <w:r/>
+      <w:r/>
+      <w:r/>
       <w:r/>
       <w:r>
-        <w:t>Garantía de 12 meses</w:t>
+        <w:rPr>
+          <w:b/>
+        </w:rPr>
+        <w:t>TU EMPRESA S.A.C.</w:t>
+        <w:br/>
+      </w:r>
+      <w:r>
+        <w:t>RUC: 20123456789 | Av. Tecnología 123, Lima</w:t>
+      </w:r>
+      <w:r/>
+      <w:r>
+        <w:t>Aceptado por: _________________________</w:t>
+        <w:br/>
+      </w:r>
+      <w:r>
+        <w:t>Fecha: ____/____/2026</w:t>
       </w:r>
       <w:r/>
       <w:r/>
@@ -552,887 +748,24 @@
       <w:r/>
       <w:r/>
       <w:r/>
-    </w:p>
-    <w:p>
-      <w:pPr>
-        <w:pStyle w:val="Heading2"/>
-      </w:pPr>
       <w:r>
-        <w:t>Detalle de la Cotización</w:t>
+        <w:rPr>
+          <w:b/>
+        </w:rPr>
+        <w:t>TU EMPRESA S.A.C.</w:t>
+        <w:br/>
       </w:r>
-      <w:r/>
-    </w:p>
-    <w:tbl>
-      <w:tblPr>
-        <w:tblStyle w:val="TableGrid"/>
-        <w:tblW w:type="auto" w:w="0"/>
-        <w:tblLook w:firstColumn="1" w:firstRow="1" w:lastColumn="0" w:lastRow="0" w:noHBand="0" w:noVBand="1" w:val="04A0"/>
-      </w:tblPr>
-      <w:tblGrid>
-        <w:gridCol w:w="1440"/>
-        <w:gridCol w:w="1440"/>
-        <w:gridCol w:w="1440"/>
-        <w:gridCol w:w="1440"/>
-        <w:gridCol w:w="1440"/>
-        <w:gridCol w:w="1440"/>
-      </w:tblGrid>
-      <w:tr>
-        <w:tc>
-          <w:tcPr>
-            <w:tcW w:type="dxa" w:w="1440"/>
-          </w:tcPr>
-          <w:p>
-            <w:r>
-              <w:rPr>
-                <w:b/>
-              </w:rPr>
-              <w:t>ITEM</w:t>
-            </w:r>
-          </w:p>
-        </w:tc>
-        <w:tc>
-          <w:tcPr>
-            <w:tcW w:type="dxa" w:w="1440"/>
-          </w:tcPr>
-          <w:p>
-            <w:r>
-              <w:rPr>
-                <w:b/>
-              </w:rPr>
-              <w:t>DESCRIPCIÓN</w:t>
-            </w:r>
-          </w:p>
-        </w:tc>
-        <w:tc>
-          <w:tcPr>
-            <w:tcW w:type="dxa" w:w="1440"/>
-          </w:tcPr>
-          <w:p>
-            <w:r>
-              <w:rPr>
-                <w:b/>
-              </w:rPr>
-              <w:t>CANT.</w:t>
-            </w:r>
-          </w:p>
-        </w:tc>
-        <w:tc>
-          <w:tcPr>
-            <w:tcW w:type="dxa" w:w="1440"/>
-          </w:tcPr>
-          <w:p>
-            <w:r>
-              <w:rPr>
-                <w:b/>
-              </w:rPr>
-              <w:t>UNIDAD</w:t>
-            </w:r>
-          </w:p>
-        </w:tc>
-        <w:tc>
-          <w:tcPr>
-            <w:tcW w:type="dxa" w:w="1440"/>
-          </w:tcPr>
-          <w:p>
-            <w:r>
-              <w:rPr>
-                <w:b/>
-              </w:rPr>
-              <w:t>P. UNIT.</w:t>
-            </w:r>
-          </w:p>
-        </w:tc>
-        <w:tc>
-          <w:tcPr>
-            <w:tcW w:type="dxa" w:w="1440"/>
-          </w:tcPr>
-          <w:p>
-            <w:r>
-              <w:rPr>
-                <w:b/>
-              </w:rPr>
-              <w:t>TOTAL</w:t>
-            </w:r>
-          </w:p>
-        </w:tc>
-      </w:tr>
-      <w:tr>
-        <w:tc>
-          <w:tcPr>
-            <w:tcW w:type="dxa" w:w="1440"/>
-          </w:tcPr>
-          <w:p>
-            <w:r>
-              <w:t>01</w:t>
-            </w:r>
-          </w:p>
-        </w:tc>
-        <w:tc>
-          <w:tcPr>
-            <w:tcW w:type="dxa" w:w="1440"/>
-          </w:tcPr>
-          <w:p>
-            <w:r>
-              <w:t>Tablero eléctrico monofásico 12 circuitos</w:t>
-            </w:r>
-          </w:p>
-        </w:tc>
-        <w:tc>
-          <w:tcPr>
-            <w:tcW w:type="dxa" w:w="1440"/>
-          </w:tcPr>
-          <w:p>
-            <w:r>
-              <w:t>1.00</w:t>
-            </w:r>
-          </w:p>
-        </w:tc>
-        <w:tc>
-          <w:tcPr>
-            <w:tcW w:type="dxa" w:w="1440"/>
-          </w:tcPr>
-          <w:p>
-            <w:r>
-              <w:t>und</w:t>
-            </w:r>
-          </w:p>
-        </w:tc>
-        <w:tc>
-          <w:tcPr>
-            <w:tcW w:type="dxa" w:w="1440"/>
-          </w:tcPr>
-          <w:p>
-            <w:r>
-              <w:t>$ 450.00</w:t>
-            </w:r>
-          </w:p>
-        </w:tc>
-        <w:tc>
-          <w:tcPr>
-            <w:tcW w:type="dxa" w:w="1440"/>
-          </w:tcPr>
-          <w:p>
-            <w:r>
-              <w:t>$ 450.00</w:t>
-            </w:r>
-          </w:p>
-        </w:tc>
-      </w:tr>
-      <w:tr>
-        <w:tc>
-          <w:tcPr>
-            <w:tcW w:type="dxa" w:w="1440"/>
-          </w:tcPr>
-          <w:p>
-            <w:r>
-              <w:t>02</w:t>
-            </w:r>
-          </w:p>
-        </w:tc>
-        <w:tc>
-          <w:tcPr>
-            <w:tcW w:type="dxa" w:w="1440"/>
-          </w:tcPr>
-          <w:p>
-            <w:r>
-              <w:t>Circuitos eléctricos (cable THW + tubería PVC)</w:t>
-            </w:r>
-          </w:p>
-        </w:tc>
-        <w:tc>
-          <w:tcPr>
-            <w:tcW w:type="dxa" w:w="1440"/>
-          </w:tcPr>
-          <w:p>
-            <w:r>
-              <w:t>6.00</w:t>
-            </w:r>
-          </w:p>
-        </w:tc>
-        <w:tc>
-          <w:tcPr>
-            <w:tcW w:type="dxa" w:w="1440"/>
-          </w:tcPr>
-          <w:p>
-            <w:r>
-              <w:t>cto</w:t>
-            </w:r>
-          </w:p>
-        </w:tc>
-        <w:tc>
-          <w:tcPr>
-            <w:tcW w:type="dxa" w:w="1440"/>
-          </w:tcPr>
-          <w:p>
-            <w:r>
-              <w:t>$ 120.00</w:t>
-            </w:r>
-          </w:p>
-        </w:tc>
-        <w:tc>
-          <w:tcPr>
-            <w:tcW w:type="dxa" w:w="1440"/>
-          </w:tcPr>
-          <w:p>
-            <w:r>
-              <w:t>$ 720.00</w:t>
-            </w:r>
-          </w:p>
-        </w:tc>
-      </w:tr>
-      <w:tr>
-        <w:tc>
-          <w:tcPr>
-            <w:tcW w:type="dxa" w:w="1440"/>
-          </w:tcPr>
-          <w:p>
-            <w:r>
-              <w:t>03</w:t>
-            </w:r>
-          </w:p>
-        </w:tc>
-        <w:tc>
-          <w:tcPr>
-            <w:tcW w:type="dxa" w:w="1440"/>
-          </w:tcPr>
-          <w:p>
-            <w:r>
-              <w:t>Puntos de iluminación LED</w:t>
-            </w:r>
-          </w:p>
-        </w:tc>
-        <w:tc>
-          <w:tcPr>
-            <w:tcW w:type="dxa" w:w="1440"/>
-          </w:tcPr>
-          <w:p>
-            <w:r>
-              <w:t>10.00</w:t>
-            </w:r>
-          </w:p>
-        </w:tc>
-        <w:tc>
-          <w:tcPr>
-            <w:tcW w:type="dxa" w:w="1440"/>
-          </w:tcPr>
-          <w:p>
-            <w:r>
-              <w:t>pto</w:t>
-            </w:r>
-          </w:p>
-        </w:tc>
-        <w:tc>
-          <w:tcPr>
-            <w:tcW w:type="dxa" w:w="1440"/>
-          </w:tcPr>
-          <w:p>
-            <w:r>
-              <w:t>$ 45.00</w:t>
-            </w:r>
-          </w:p>
-        </w:tc>
-        <w:tc>
-          <w:tcPr>
-            <w:tcW w:type="dxa" w:w="1440"/>
-          </w:tcPr>
-          <w:p>
-            <w:r>
-              <w:t>$ 450.00</w:t>
-            </w:r>
-          </w:p>
-        </w:tc>
-      </w:tr>
-      <w:tr>
-        <w:tc>
-          <w:tcPr>
-            <w:tcW w:type="dxa" w:w="1440"/>
-          </w:tcPr>
-          <w:p>
-            <w:r>
-              <w:t>04</w:t>
-            </w:r>
-          </w:p>
-        </w:tc>
-        <w:tc>
-          <w:tcPr>
-            <w:tcW w:type="dxa" w:w="1440"/>
-          </w:tcPr>
-          <w:p>
-            <w:r>
-              <w:t>Tomacorrientes dobles con toma tierra</w:t>
-            </w:r>
-          </w:p>
-        </w:tc>
-        <w:tc>
-          <w:tcPr>
-            <w:tcW w:type="dxa" w:w="1440"/>
-          </w:tcPr>
-          <w:p>
-            <w:r>
-              <w:t>7.00</w:t>
-            </w:r>
-          </w:p>
-        </w:tc>
-        <w:tc>
-          <w:tcPr>
-            <w:tcW w:type="dxa" w:w="1440"/>
-          </w:tcPr>
-          <w:p>
-            <w:r>
-              <w:t>pto</w:t>
-            </w:r>
-          </w:p>
-        </w:tc>
-        <w:tc>
-          <w:tcPr>
-            <w:tcW w:type="dxa" w:w="1440"/>
-          </w:tcPr>
-          <w:p>
-            <w:r>
-              <w:t>$ 35.00</w:t>
-            </w:r>
-          </w:p>
-        </w:tc>
-        <w:tc>
-          <w:tcPr>
-            <w:tcW w:type="dxa" w:w="1440"/>
-          </w:tcPr>
-          <w:p>
-            <w:r>
-              <w:t>$ 245.00</w:t>
-            </w:r>
-          </w:p>
-        </w:tc>
-      </w:tr>
-      <w:tr>
-        <w:tc>
-          <w:tcPr>
-            <w:tcW w:type="dxa" w:w="1440"/>
-          </w:tcPr>
-          <w:p>
-            <w:r>
-              <w:t>05</w:t>
-            </w:r>
-          </w:p>
-        </w:tc>
-        <w:tc>
-          <w:tcPr>
-            <w:tcW w:type="dxa" w:w="1440"/>
-          </w:tcPr>
-          <w:p>
-            <w:r>
-              <w:t>Sistema de puesta a tierra</w:t>
-            </w:r>
-          </w:p>
-        </w:tc>
-        <w:tc>
-          <w:tcPr>
-            <w:tcW w:type="dxa" w:w="1440"/>
-          </w:tcPr>
-          <w:p>
-            <w:r>
-              <w:t>1.00</w:t>
-            </w:r>
-          </w:p>
-        </w:tc>
-        <w:tc>
-          <w:tcPr>
-            <w:tcW w:type="dxa" w:w="1440"/>
-          </w:tcPr>
-          <w:p>
-            <w:r>
-              <w:t>glb</w:t>
-            </w:r>
-          </w:p>
-        </w:tc>
-        <w:tc>
-          <w:tcPr>
-            <w:tcW w:type="dxa" w:w="1440"/>
-          </w:tcPr>
-          <w:p>
-            <w:r>
-              <w:t>$ 850.00</w:t>
-            </w:r>
-          </w:p>
-        </w:tc>
-        <w:tc>
-          <w:tcPr>
-            <w:tcW w:type="dxa" w:w="1440"/>
-          </w:tcPr>
-          <w:p>
-            <w:r>
-              <w:t>$ 850.00</w:t>
-            </w:r>
-          </w:p>
-        </w:tc>
-      </w:tr>
-      <w:tr>
-        <w:tc>
-          <w:tcPr>
-            <w:tcW w:type="dxa" w:w="1440"/>
-          </w:tcPr>
-          <w:p>
-            <w:r>
-              <w:t>06</w:t>
-            </w:r>
-          </w:p>
-        </w:tc>
-        <w:tc>
-          <w:tcPr>
-            <w:tcW w:type="dxa" w:w="1440"/>
-          </w:tcPr>
-          <w:p>
-            <w:r>
-              <w:t>Tablero de medición y protección</w:t>
-            </w:r>
-          </w:p>
-        </w:tc>
-        <w:tc>
-          <w:tcPr>
-            <w:tcW w:type="dxa" w:w="1440"/>
-          </w:tcPr>
-          <w:p>
-            <w:r>
-              <w:t>1.00</w:t>
-            </w:r>
-          </w:p>
-        </w:tc>
-        <w:tc>
-          <w:tcPr>
-            <w:tcW w:type="dxa" w:w="1440"/>
-          </w:tcPr>
-          <w:p>
-            <w:r>
-              <w:t>und</w:t>
-            </w:r>
-          </w:p>
-        </w:tc>
-        <w:tc>
-          <w:tcPr>
-            <w:tcW w:type="dxa" w:w="1440"/>
-          </w:tcPr>
-          <w:p>
-            <w:r>
-              <w:t>$ 380.00</w:t>
-            </w:r>
-          </w:p>
-        </w:tc>
-        <w:tc>
-          <w:tcPr>
-            <w:tcW w:type="dxa" w:w="1440"/>
-          </w:tcPr>
-          <w:p>
-            <w:r>
-              <w:t>$ 380.00</w:t>
-            </w:r>
-          </w:p>
-        </w:tc>
-      </w:tr>
-      <w:tr>
-        <w:tc>
-          <w:tcPr>
-            <w:tcW w:type="dxa" w:w="1440"/>
-          </w:tcPr>
-          <w:p>
-            <w:r>
-              <w:t>07</w:t>
-            </w:r>
-          </w:p>
-        </w:tc>
-        <w:tc>
-          <w:tcPr>
-            <w:tcW w:type="dxa" w:w="1440"/>
-          </w:tcPr>
-          <w:p>
-            <w:r>
-              <w:t>Interruptores termo-magnéticos</w:t>
-            </w:r>
-          </w:p>
-        </w:tc>
-        <w:tc>
-          <w:tcPr>
-            <w:tcW w:type="dxa" w:w="1440"/>
-          </w:tcPr>
-          <w:p>
-            <w:r>
-              <w:t>6.00</w:t>
-            </w:r>
-          </w:p>
-        </w:tc>
-        <w:tc>
-          <w:tcPr>
-            <w:tcW w:type="dxa" w:w="1440"/>
-          </w:tcPr>
-          <w:p>
-            <w:r>
-              <w:t>und</w:t>
-            </w:r>
-          </w:p>
-        </w:tc>
-        <w:tc>
-          <w:tcPr>
-            <w:tcW w:type="dxa" w:w="1440"/>
-          </w:tcPr>
-          <w:p>
-            <w:r>
-              <w:t>$ 45.00</w:t>
-            </w:r>
-          </w:p>
-        </w:tc>
-        <w:tc>
-          <w:tcPr>
-            <w:tcW w:type="dxa" w:w="1440"/>
-          </w:tcPr>
-          <w:p>
-            <w:r>
-              <w:t>$ 270.00</w:t>
-            </w:r>
-          </w:p>
-        </w:tc>
-      </w:tr>
-    </w:tbl>
-    <w:p>
-      <w:r/>
-      <w:r/>
-      <w:r/>
-      <w:r/>
-      <w:r/>
-      <w:r/>
       <w:r>
-        <w:t>SUBTOTAL:</w:t>
+        <w:t>Generado automáticamente - Sistema PILi Quarts</w:t>
       </w:r>
       <w:r/>
       <w:r>
-        <w:t>$ {{ subtotal }}</w:t>
+        <w:t>Aceptado por: _________________________</w:t>
+        <w:br/>
       </w:r>
-      <w:r/>
-      <w:r/>
-      <w:r/>
       <w:r>
-        <w:t>IGV (18%):</w:t>
+        <w:t>Fecha de Aceptación: ____/____/2026</w:t>
       </w:r>
-      <w:r/>
-      <w:r>
-        <w:t>$ {{ igv }}</w:t>
-      </w:r>
-      <w:r/>
-      <w:r/>
-      <w:r/>
-      <w:r>
-        <w:t>TOTAL:</w:t>
-      </w:r>
-      <w:r/>
-      <w:r>
-        <w:t>$ {{ total }}</w:t>
-      </w:r>
-      <w:r/>
-      <w:r/>
-      <w:r/>
-      <w:r/>
-      <w:r/>
-      <w:r/>
-    </w:p>
-    <w:p>
-      <w:pPr>
-        <w:pStyle w:val="Heading2"/>
-      </w:pPr>
-      <w:r>
-        <w:t>Cronograma Estimado</w:t>
-      </w:r>
-      <w:r/>
-      <w:r/>
-      <w:r/>
-      <w:r>
-        <w:t>1</w:t>
-      </w:r>
-      <w:r/>
-      <w:r>
-        <w:t>Ingeniería</w:t>
-      </w:r>
-      <w:r/>
-      <w:r>
-        <w:t>{{ dias_ingenieria }} días</w:t>
-      </w:r>
-      <w:r/>
-      <w:r/>
-      <w:r/>
-      <w:r>
-        <w:t>2</w:t>
-      </w:r>
-      <w:r/>
-      <w:r>
-        <w:t>Adquisiciones</w:t>
-      </w:r>
-      <w:r/>
-      <w:r>
-        <w:t>{{ dias_adquisiciones }} días</w:t>
-      </w:r>
-      <w:r/>
-      <w:r/>
-      <w:r/>
-      <w:r>
-        <w:t>3</w:t>
-      </w:r>
-      <w:r/>
-      <w:r>
-        <w:t>Instalación</w:t>
-      </w:r>
-      <w:r/>
-      <w:r>
-        <w:t>{{ dias_instalacion }} días</w:t>
-      </w:r>
-      <w:r/>
-      <w:r/>
-      <w:r/>
-      <w:r>
-        <w:t>4</w:t>
-      </w:r>
-      <w:r/>
-      <w:r>
-        <w:t>Pruebas</w:t>
-      </w:r>
-      <w:r/>
-      <w:r>
-        <w:t>{{ dias_pruebas }} días</w:t>
-      </w:r>
-      <w:r/>
-      <w:r/>
-      <w:r/>
-      <w:r/>
-      <w:r/>
-      <w:r/>
-    </w:p>
-    <w:p>
-      <w:pPr>
-        <w:pStyle w:val="Heading2"/>
-      </w:pPr>
-      <w:r>
-        <w:t>Garantías Incluidas</w:t>
-      </w:r>
-      <w:r/>
-      <w:r/>
-      <w:r/>
-      <w:r>
-        <w:t>🛠️</w:t>
-      </w:r>
-      <w:r/>
-      <w:r>
-        <w:t>12 meses en mano de obra</w:t>
-      </w:r>
-      <w:r/>
-      <w:r/>
-      <w:r/>
-      <w:r>
-        <w:t>⚙️</w:t>
-      </w:r>
-      <w:r/>
-      <w:r>
-        <w:t>Garantía de fabricante en equipos</w:t>
-      </w:r>
-      <w:r/>
-      <w:r/>
-      <w:r/>
-      <w:r>
-        <w:t>💬</w:t>
-      </w:r>
-      <w:r/>
-      <w:r>
-        <w:t>Soporte técnico por 6 meses</w:t>
-      </w:r>
-      <w:r/>
-      <w:r/>
-      <w:r/>
-      <w:r/>
-      <w:r/>
-      <w:r/>
-    </w:p>
-    <w:p>
-      <w:pPr>
-        <w:pStyle w:val="Heading2"/>
-      </w:pPr>
-      <w:r>
-        <w:t>Condiciones de Pago</w:t>
-      </w:r>
-      <w:r/>
-      <w:r/>
-    </w:p>
-    <w:p>
-      <w:pPr>
-        <w:pStyle w:val="ListBullet"/>
-        <w:spacing w:line="240" w:lineRule="auto"/>
-        <w:ind w:left="720"/>
-      </w:pPr>
-      <w:r/>
-      <w:r>
-        <w:t>50% de adelanto a la firma del contrato</w:t>
-      </w:r>
-      <w:r/>
-    </w:p>
-    <w:p>
-      <w:pPr>
-        <w:pStyle w:val="ListBullet"/>
-        <w:spacing w:line="240" w:lineRule="auto"/>
-        <w:ind w:left="720"/>
-      </w:pPr>
-      <w:r/>
-      <w:r>
-        <w:t>30% al 50% de avance de obra</w:t>
-      </w:r>
-      <w:r/>
-    </w:p>
-    <w:p>
-      <w:pPr>
-        <w:pStyle w:val="ListBullet"/>
-        <w:spacing w:line="240" w:lineRule="auto"/>
-        <w:ind w:left="720"/>
-      </w:pPr>
-      <w:r/>
-      <w:r>
-        <w:t>20% contra entrega y conformidad</w:t>
-      </w:r>
-      <w:r/>
-      <w:r/>
-      <w:r/>
-      <w:r/>
-      <w:r/>
-    </w:p>
-    <w:p>
-      <w:pPr>
-        <w:pStyle w:val="Heading2"/>
-      </w:pPr>
-      <w:r>
-        <w:t>Observaciones Técnicas</w:t>
-      </w:r>
-      <w:r/>
-      <w:r/>
-    </w:p>
-    <w:p>
-      <w:pPr>
-        <w:pStyle w:val="ListBullet"/>
-        <w:spacing w:line="240" w:lineRule="auto"/>
-        <w:ind w:left="720"/>
-      </w:pPr>
-      <w:r/>
-      <w:r>
-        <w:t>Trabajos ejecutados según {{ normativa_aplicable }}</w:t>
-      </w:r>
-      <w:r/>
-    </w:p>
-    <w:p>
-      <w:pPr>
-        <w:pStyle w:val="ListBullet"/>
-        <w:spacing w:line="240" w:lineRule="auto"/>
-        <w:ind w:left="720"/>
-      </w:pPr>
-      <w:r/>
-      <w:r>
-        <w:t>Materiales de primera calidad con certificación internacional</w:t>
-      </w:r>
-      <w:r/>
-    </w:p>
-    <w:p>
-      <w:pPr>
-        <w:pStyle w:val="ListBullet"/>
-        <w:spacing w:line="240" w:lineRule="auto"/>
-        <w:ind w:left="720"/>
-      </w:pPr>
-      <w:r/>
-      <w:r>
-        <w:t>Mano de obra especializada y certificada</w:t>
-      </w:r>
-      <w:r/>
-    </w:p>
-    <w:p>
-      <w:pPr>
-        <w:pStyle w:val="ListBullet"/>
-        <w:spacing w:line="240" w:lineRule="auto"/>
-        <w:ind w:left="720"/>
-      </w:pPr>
-      <w:r/>
-      <w:r>
-        <w:t>Incluye transporte de materiales</w:t>
-      </w:r>
-      <w:r/>
-    </w:p>
-    <w:p>
-      <w:pPr>
-        <w:pStyle w:val="ListBullet"/>
-        <w:spacing w:line="240" w:lineRule="auto"/>
-        <w:ind w:left="720"/>
-      </w:pPr>
-      <w:r/>
-      <w:r>
-        <w:t>Pruebas y puesta en marcha incluidas</w:t>
-      </w:r>
-      <w:r/>
-    </w:p>
-    <w:p>
-      <w:pPr>
-        <w:pStyle w:val="ListBullet"/>
-        <w:spacing w:line="240" w:lineRule="auto"/>
-        <w:ind w:left="720"/>
-      </w:pPr>
-      <w:r/>
-      <w:r>
-        <w:t>Capacitación al personal del cliente</w:t>
-      </w:r>
-      <w:r/>
-    </w:p>
-    <w:p>
-      <w:pPr>
-        <w:pStyle w:val="ListBullet"/>
-        <w:spacing w:line="240" w:lineRule="auto"/>
-        <w:ind w:left="720"/>
-      </w:pPr>
-      <w:r/>
-      <w:r>
-        <w:t>Documentación técnica completa (planos as-built, protocolos, certificados)</w:t>
-      </w:r>
-      <w:r/>
-    </w:p>
-    <w:p>
-      <w:pPr>
-        <w:pStyle w:val="ListBullet"/>
-        <w:spacing w:line="240" w:lineRule="auto"/>
-        <w:ind w:left="720"/>
-      </w:pPr>
-      <w:r/>
-      <w:r>
-        <w:t>Precios en dólares americanos (USD)</w:t>
-      </w:r>
-      <w:r/>
-    </w:p>
-    <w:p>
-      <w:pPr>
-        <w:pStyle w:val="ListBullet"/>
-        <w:spacing w:line="240" w:lineRule="auto"/>
-        <w:ind w:left="720"/>
-      </w:pPr>
-      <w:r/>
-      <w:r>
-        <w:t>Cotización válida por {{ vigencia }}</w:t>
-      </w:r>
-      <w:r/>
-      <w:r/>
-      <w:r/>
-      <w:r/>
-      <w:r/>
-      <w:r>
-        <w:t>TESLA ELECTRICIDAD Y AUTOMATIZACIÓN S.A.C.</w:t>
-      </w:r>
-      <w:r/>
-      <w:r>
-        <w:t>RUC: 20601138787 | Teléfono: 906 315 961</w:t>
-      </w:r>
-      <w:r/>
-      <w:r>
-        <w:t>Email: ingenieria.teslaelectricidad@gmail.com</w:t>
-      </w:r>
-      <w:r/>
-      <w:r>
-        <w:t>Jr. Las Ágatas Mz B Lote 09, Urb. San Carlos, SJL</w:t>
-      </w:r>
-      <w:r/>
       <w:r/>
       <w:r/>
       <w:r/>
@@ -1446,42 +779,6 @@
     </w:sectPr>
   </w:body>
 </w:document>
-</file>
-
-<file path=word/footer1.xml><?xml version="1.0" encoding="utf-8"?>
-<w:ftr xmlns:m="http://schemas.openxmlformats.org/officeDocument/2006/math" xmlns:mc="http://schemas.openxmlformats.org/markup-compatibility/2006" xmlns:mo="http://schemas.microsoft.com/office/mac/office/2008/main" xmlns:mv="urn:schemas-microsoft-com:mac:vml" xmlns:o="urn:schemas-microsoft-com:office:office" xmlns:r="http://schemas.openxmlformats.org/officeDocument/2006/relationships" xmlns:v="urn:schemas-microsoft-com:vml" xmlns:w10="urn:schemas-microsoft-com:office:word" xmlns:w14="http://schemas.microsoft.com/office/word/2010/wordml" xmlns:w="http://schemas.openxmlformats.org/wordprocessingml/2006/main" xmlns:wne="http://schemas.microsoft.com/office/word/2006/wordml" xmlns:wp14="http://schemas.microsoft.com/office/word/2010/wordprocessingDrawing" xmlns:wp="http://schemas.openxmlformats.org/drawingml/2006/wordprocessingDrawing" xmlns:wpc="http://schemas.microsoft.com/office/word/2010/wordprocessingCanvas" xmlns:wpg="http://schemas.microsoft.com/office/word/2010/wordprocessingGroup" xmlns:wpi="http://schemas.microsoft.com/office/word/2010/wordprocessingInk" xmlns:wps="http://schemas.microsoft.com/office/word/2010/wordprocessingShape" mc:Ignorable="w14 wp14">
-  <w:p>
-    <w:pPr>
-      <w:pStyle w:val="Footer"/>
-      <w:jc w:val="center"/>
-    </w:pPr>
-    <w:r>
-      <w:t>Documento Generado por Sistema RALFTH - Tesla Electricidad v10.0</w:t>
-    </w:r>
-  </w:p>
-</w:ftr>
-</file>
-
-<file path=word/header1.xml><?xml version="1.0" encoding="utf-8"?>
-<w:hdr xmlns:m="http://schemas.openxmlformats.org/officeDocument/2006/math" xmlns:mc="http://schemas.openxmlformats.org/markup-compatibility/2006" xmlns:mo="http://schemas.microsoft.com/office/mac/office/2008/main" xmlns:mv="urn:schemas-microsoft-com:mac:vml" xmlns:o="urn:schemas-microsoft-com:office:office" xmlns:r="http://schemas.openxmlformats.org/officeDocument/2006/relationships" xmlns:v="urn:schemas-microsoft-com:vml" xmlns:w10="urn:schemas-microsoft-com:office:word" xmlns:w14="http://schemas.microsoft.com/office/word/2010/wordml" xmlns:w="http://schemas.openxmlformats.org/wordprocessingml/2006/main" xmlns:wne="http://schemas.microsoft.com/office/word/2006/wordml" xmlns:wp14="http://schemas.microsoft.com/office/word/2010/wordprocessingDrawing" xmlns:wp="http://schemas.openxmlformats.org/drawingml/2006/wordprocessingDrawing" xmlns:wpc="http://schemas.microsoft.com/office/word/2010/wordprocessingCanvas" xmlns:wpg="http://schemas.microsoft.com/office/word/2010/wordprocessingGroup" xmlns:wpi="http://schemas.microsoft.com/office/word/2010/wordprocessingInk" xmlns:wps="http://schemas.microsoft.com/office/word/2010/wordprocessingShape" mc:Ignorable="w14 wp14">
-  <w:p>
-    <w:pPr>
-      <w:pStyle w:val="Header"/>
-      <w:jc w:val="center"/>
-    </w:pPr>
-    <w:r>
-      <w:t>TESLA ELECTRICIDAD Y AUTOMATIZACIÓN S.A.C.</w:t>
-    </w:r>
-  </w:p>
-  <w:p>
-    <w:pPr>
-      <w:jc w:val="center"/>
-    </w:pPr>
-    <w:r>
-      <w:t>RUC: 20601138787 | Ingeniera de Detalle y Mantenimiento</w:t>
-    </w:r>
-  </w:p>
-</w:hdr>
 </file>
 
 <file path=word/numbering.xml><?xml version="1.0" encoding="utf-8"?>
@@ -1847,11 +1144,6 @@
     <w:name w:val="Normal"/>
     <w:qFormat/>
     <w:rsid w:val="00FC693F"/>
-    <w:rPr>
-      <w:rFonts w:ascii="Calibri" w:hAnsi="Calibri"/>
-      <w:color w:val="0052A3"/>
-      <w:sz w:val="22"/>
-    </w:rPr>
   </w:style>
   <w:style w:type="paragraph" w:styleId="Header">
     <w:name w:val="header"/>
@@ -1867,11 +1159,6 @@
       </w:tabs>
       <w:spacing w:after="0" w:line="240" w:lineRule="auto"/>
     </w:pPr>
-    <w:rPr>
-      <w:b/>
-      <w:color w:val="0052A3"/>
-      <w:sz w:val="28"/>
-    </w:rPr>
   </w:style>
   <w:style w:type="character" w:customStyle="1" w:styleId="HeaderChar">
     <w:name w:val="Header Char"/>
@@ -1894,9 +1181,6 @@
       </w:tabs>
       <w:spacing w:after="0" w:line="240" w:lineRule="auto"/>
     </w:pPr>
-    <w:rPr>
-      <w:sz w:val="16"/>
-    </w:rPr>
   </w:style>
   <w:style w:type="character" w:customStyle="1" w:styleId="FooterChar">
     <w:name w:val="Footer Char"/>

</xml_diff>

<commit_message>
feat(N04): Restore Mirror Engine bridging in index.py and Update N04 Skills documentation
</commit_message>
<xml_diff>
--- a/PILi_Quarts_V3.0/backend/modules/N04_Binary_Factory/output_sandbox/STUDIO_COTIZACION_COMPLEJA.docx
+++ b/PILi_Quarts_V3.0/backend/modules/N04_Binary_Factory/output_sandbox/STUDIO_COTIZACION_COMPLEJA.docx
@@ -3,391 +3,102 @@
 <w:document xmlns:wpc="http://schemas.microsoft.com/office/word/2010/wordprocessingCanvas" xmlns:mo="http://schemas.microsoft.com/office/mac/office/2008/main" xmlns:mc="http://schemas.openxmlformats.org/markup-compatibility/2006" xmlns:mv="urn:schemas-microsoft-com:mac:vml" xmlns:o="urn:schemas-microsoft-com:office:office" xmlns:r="http://schemas.openxmlformats.org/officeDocument/2006/relationships" xmlns:m="http://schemas.openxmlformats.org/officeDocument/2006/math" xmlns:v="urn:schemas-microsoft-com:vml" xmlns:wp14="http://schemas.microsoft.com/office/word/2010/wordprocessingDrawing" xmlns:wp="http://schemas.openxmlformats.org/drawingml/2006/wordprocessingDrawing" xmlns:w10="urn:schemas-microsoft-com:office:word" xmlns:w="http://schemas.openxmlformats.org/wordprocessingml/2006/main" xmlns:w14="http://schemas.microsoft.com/office/word/2010/wordml" xmlns:wpg="http://schemas.microsoft.com/office/word/2010/wordprocessingGroup" xmlns:wpi="http://schemas.microsoft.com/office/word/2010/wordprocessingInk" xmlns:wne="http://schemas.microsoft.com/office/word/2006/wordml" xmlns:wps="http://schemas.microsoft.com/office/word/2010/wordprocessingShape" mc:Ignorable="w14 wp14">
   <w:body>
     <w:p>
-      <w:r/>
-      <w:r/>
-    </w:p>
-    <w:p>
-      <w:r/>
-      <w:r/>
-      <w:r/>
-      <w:r/>
-      <w:r/>
-      <w:r/>
-      <w:r/>
-      <w:r/>
+      <w:pPr>
+        <w:pStyle w:val="Title"/>
+        <w:jc w:val="center"/>
+      </w:pPr>
       <w:r>
-        <w:t>PILI</w:t>
+        <w:t>{{ TITULO_DOCUMENTO }}</w:t>
       </w:r>
-      <w:r/>
-      <w:r/>
-      <w:r/>
-      <w:r/>
-      <w:r/>
-      <w:r>
-        <w:t>TU EMPRESA S.A.C.</w:t>
-      </w:r>
-      <w:r/>
-      <w:r>
-        <w:t xml:space="preserve">RUC: </w:t>
-      </w:r>
-      <w:r>
-        <w:t>20123456789</w:t>
-        <w:br/>
-      </w:r>
-      <w:r/>
-      <w:r>
-        <w:t>Av. Tecnología 123, Lima</w:t>
-        <w:br/>
-      </w:r>
-      <w:r>
-        <w:t xml:space="preserve">Email: </w:t>
-      </w:r>
-      <w:r>
-        <w:t>contacto@empresa.com</w:t>
-      </w:r>
-      <w:r>
-        <w:t xml:space="preserve"> | Tel: </w:t>
-      </w:r>
-      <w:r>
-        <w:t>000 000 000</w:t>
-      </w:r>
-      <w:r/>
-      <w:r/>
-      <w:r/>
-      <w:r/>
-      <w:r/>
-      <w:r/>
     </w:p>
     <w:p>
       <w:pPr>
-        <w:pStyle w:val="Heading1"/>
+        <w:jc w:val="center"/>
       </w:pPr>
       <w:r>
-        <w:t>COTIZACION COMPLEJA</w:t>
+        <w:t>Código: {{ CODIGO_DOC }} | Fecha: {{ FECHA_DOC }}</w:t>
       </w:r>
-      <w:r/>
-    </w:p>
-    <w:p>
-      <w:r/>
-      <w:r>
-        <w:t>Servicios de Ingeniería Especializada</w:t>
-      </w:r>
-      <w:r/>
-    </w:p>
-    <w:p>
-      <w:r/>
-      <w:r>
-        <w:t>N° N04-SOL-2026-045 | Fecha: 24/02/2026</w:t>
-      </w:r>
-      <w:r/>
-      <w:r/>
-      <w:r/>
-      <w:r/>
-      <w:r/>
-      <w:r>
-        <w:t>DATOS DEL CLIENTE</w:t>
-      </w:r>
-      <w:r/>
-      <w:r>
-        <w:t>Empresa:</w:t>
-      </w:r>
-      <w:r>
-        <w:t xml:space="preserve"> </w:t>
-      </w:r>
-      <w:r>
-        <w:t>INDUSTRIAL SOLUTIONS PERÚ S.A.</w:t>
-      </w:r>
-      <w:r/>
-      <w:r>
-        <w:t>RUC/ID:</w:t>
-      </w:r>
-      <w:r>
-        <w:t xml:space="preserve"> </w:t>
-      </w:r>
-      <w:r>
-        <w:t>20555666777</w:t>
-      </w:r>
-      <w:r/>
-      <w:r>
-        <w:t>Dirección:</w:t>
-      </w:r>
-      <w:r>
-        <w:t xml:space="preserve"> </w:t>
-      </w:r>
-      <w:r>
-        <w:t>Parque Industrial Lote 45, Lurín</w:t>
-      </w:r>
-      <w:r/>
-      <w:r>
-        <w:t>Solicitado:</w:t>
-      </w:r>
-      <w:r>
-        <w:t xml:space="preserve"> </w:t>
-      </w:r>
-      <w:r>
-        <w:t>gerencia@industrial.com</w:t>
-      </w:r>
-      <w:r/>
-      <w:r/>
-      <w:r/>
-      <w:r>
-        <w:t>RESUMEN EJECUTIVO</w:t>
-      </w:r>
-      <w:r/>
-      <w:r>
-        <w:t>Proyecto:</w:t>
-      </w:r>
-      <w:r>
-        <w:t xml:space="preserve"> </w:t>
-      </w:r>
-      <w:r>
-        <w:t>SISTEMA DE AUTOMATIZACIÓN Y CONTROL Q3</w:t>
-      </w:r>
-      <w:r/>
-      <w:r>
-        <w:t>Validez:</w:t>
-      </w:r>
-      <w:r>
-        <w:t xml:space="preserve"> </w:t>
-      </w:r>
-      <w:r>
-        <w:t>15 días calendario</w:t>
-      </w:r>
-      <w:r/>
-      <w:r>
-        <w:t>Moneda:</w:t>
-      </w:r>
-      <w:r>
-        <w:t xml:space="preserve"> </w:t>
-      </w:r>
-      <w:r>
-        <w:t>Soles (S/)</w:t>
-      </w:r>
-      <w:r/>
-      <w:r/>
-      <w:r/>
-      <w:r/>
-      <w:r/>
-      <w:r/>
-      <w:r/>
     </w:p>
     <w:p>
       <w:pPr>
-        <w:pStyle w:val="Heading3"/>
+        <w:pStyle w:val="Heading2"/>
       </w:pPr>
       <w:r>
-        <w:t>Información del Solicitante</w:t>
+        <w:t>Detalle de Items</w:t>
       </w:r>
-      <w:r/>
-      <w:r/>
-    </w:p>
-    <w:p>
-      <w:r/>
-      <w:r>
-        <w:rPr>
-          <w:b/>
-        </w:rPr>
-        <w:t>Empresa:</w:t>
-      </w:r>
-      <w:r>
-        <w:t xml:space="preserve"> </w:t>
-      </w:r>
-      <w:r>
-        <w:t>INDUSTRIAL SOLUTIONS PERÚ S.A.</w:t>
-      </w:r>
-      <w:r/>
-    </w:p>
-    <w:p>
-      <w:r/>
-      <w:r>
-        <w:rPr>
-          <w:b/>
-        </w:rPr>
-        <w:t>ID/RUC:</w:t>
-      </w:r>
-      <w:r>
-        <w:t xml:space="preserve"> </w:t>
-      </w:r>
-      <w:r>
-        <w:t>20555666777</w:t>
-      </w:r>
-      <w:r/>
-    </w:p>
-    <w:p>
-      <w:r/>
-      <w:r>
-        <w:rPr>
-          <w:b/>
-        </w:rPr>
-        <w:t>Ubicación:</w:t>
-      </w:r>
-      <w:r>
-        <w:t xml:space="preserve"> </w:t>
-      </w:r>
-      <w:r>
-        <w:t>Parque Industrial Lote 45, Lurín</w:t>
-      </w:r>
-      <w:r/>
-    </w:p>
-    <w:p>
-      <w:r/>
-      <w:r>
-        <w:rPr>
-          <w:b/>
-        </w:rPr>
-        <w:t>Email:</w:t>
-      </w:r>
-      <w:r>
-        <w:t xml:space="preserve"> </w:t>
-      </w:r>
-      <w:r>
-        <w:t>gerencia@industrial.com</w:t>
-      </w:r>
-      <w:r/>
-      <w:r/>
-      <w:r/>
-      <w:r/>
-    </w:p>
-    <w:p>
-      <w:pPr>
-        <w:pStyle w:val="Heading3"/>
-      </w:pPr>
-      <w:r>
-        <w:t>Resumen del Proyecto</w:t>
-      </w:r>
-      <w:r/>
-      <w:r/>
-    </w:p>
-    <w:p>
-      <w:r/>
-      <w:r>
-        <w:rPr>
-          <w:b/>
-        </w:rPr>
-        <w:t>Alcance:</w:t>
-      </w:r>
-      <w:r>
-        <w:t xml:space="preserve"> </w:t>
-      </w:r>
-      <w:r>
-        <w:t>SISTEMA DE AUTOMATIZACIÓN Y CONTROL Q3</w:t>
-      </w:r>
-      <w:r/>
-    </w:p>
-    <w:p>
-      <w:r/>
-      <w:r>
-        <w:rPr>
-          <w:b/>
-        </w:rPr>
-        <w:t>Validez:</w:t>
-      </w:r>
-      <w:r>
-        <w:t xml:space="preserve"> </w:t>
-      </w:r>
-      <w:r>
-        <w:t>15 días calendario</w:t>
-      </w:r>
-      <w:r>
-        <w:t xml:space="preserve"> días calendario</w:t>
-      </w:r>
-      <w:r/>
-      <w:r/>
-      <w:r/>
-      <w:r/>
-      <w:r/>
-    </w:p>
-    <w:p>
-      <w:pPr>
-        <w:jc w:val="both"/>
-      </w:pPr>
-      <w:r/>
-      <w:r>
-        <w:t>Presentamos la siguiente propuesta técnica-económica diseñada para satisfacer los requerimientos específicos de su organización, garantizando los más altos estándares de calidad y seguridad industrial.</w:t>
-      </w:r>
-      <w:r/>
-      <w:r/>
-      <w:r/>
-      <w:r>
-        <w:t>DESGLOSE DE SUMINISTROS Y SERVICIOS</w:t>
-      </w:r>
-      <w:r/>
     </w:p>
     <w:tbl>
       <w:tblPr>
+        <w:tblStyle w:val="TableGrid"/>
         <w:tblW w:type="auto" w:w="0"/>
         <w:tblLook w:firstColumn="1" w:firstRow="1" w:lastColumn="0" w:lastRow="0" w:noHBand="0" w:noVBand="1" w:val="04A0"/>
       </w:tblPr>
       <w:tblGrid>
-        <w:gridCol w:w="1728"/>
-        <w:gridCol w:w="1728"/>
-        <w:gridCol w:w="1728"/>
-        <w:gridCol w:w="1728"/>
-        <w:gridCol w:w="1728"/>
+        <w:gridCol w:w="1440"/>
+        <w:gridCol w:w="1440"/>
+        <w:gridCol w:w="1440"/>
+        <w:gridCol w:w="1440"/>
+        <w:gridCol w:w="1440"/>
+        <w:gridCol w:w="1440"/>
       </w:tblGrid>
       <w:tr>
         <w:tc>
           <w:tcPr>
-            <w:tcW w:type="dxa" w:w="1728"/>
+            <w:tcW w:type="dxa" w:w="1440"/>
           </w:tcPr>
           <w:p>
             <w:r>
-              <w:rPr>
-                <w:b/>
-              </w:rPr>
-              <w:t>Ítem</w:t>
+              <w:t>ITEM</w:t>
             </w:r>
           </w:p>
         </w:tc>
         <w:tc>
           <w:tcPr>
-            <w:tcW w:type="dxa" w:w="1728"/>
+            <w:tcW w:type="dxa" w:w="1440"/>
           </w:tcPr>
           <w:p>
             <w:r>
-              <w:rPr>
-                <w:b/>
-              </w:rPr>
-              <w:t>Descripción Detallada</w:t>
+              <w:t>DESCRIPCIÓN</w:t>
             </w:r>
           </w:p>
         </w:tc>
         <w:tc>
           <w:tcPr>
-            <w:tcW w:type="dxa" w:w="1728"/>
+            <w:tcW w:type="dxa" w:w="1440"/>
           </w:tcPr>
           <w:p>
             <w:r>
-              <w:rPr>
-                <w:b/>
-              </w:rPr>
-              <w:t>Cant.</w:t>
+              <w:t>CANT.</w:t>
             </w:r>
           </w:p>
         </w:tc>
         <w:tc>
           <w:tcPr>
-            <w:tcW w:type="dxa" w:w="1728"/>
+            <w:tcW w:type="dxa" w:w="1440"/>
           </w:tcPr>
           <w:p>
             <w:r>
-              <w:rPr>
-                <w:b/>
-              </w:rPr>
-              <w:t>Und.</w:t>
+              <w:t>UND</w:t>
             </w:r>
           </w:p>
         </w:tc>
         <w:tc>
           <w:tcPr>
-            <w:tcW w:type="dxa" w:w="1728"/>
+            <w:tcW w:type="dxa" w:w="1440"/>
           </w:tcPr>
           <w:p>
             <w:r>
-              <w:rPr>
-                <w:b/>
-              </w:rPr>
-              <w:t>Total</w:t>
+              <w:t>P.UNIT</w:t>
+            </w:r>
+          </w:p>
+        </w:tc>
+        <w:tc>
+          <w:tcPr>
+            <w:tcW w:type="dxa" w:w="1440"/>
+          </w:tcPr>
+          <w:p>
+            <w:r>
+              <w:t>TOTAL</w:t>
             </w:r>
           </w:p>
         </w:tc>
@@ -395,29 +106,228 @@
       <w:tr>
         <w:tc>
           <w:tcPr>
-            <w:tcW w:type="dxa" w:w="1728"/>
+            <w:tcW w:type="dxa" w:w="1440"/>
           </w:tcPr>
           <w:p>
             <w:r>
-              <w:t>01</w:t>
+              <w:t>{% for i in items %}{{ i.item }}</w:t>
             </w:r>
           </w:p>
         </w:tc>
         <w:tc>
           <w:tcPr>
-            <w:tcW w:type="dxa" w:w="1728"/>
+            <w:tcW w:type="dxa" w:w="1440"/>
           </w:tcPr>
           <w:p>
-            <w:r/>
             <w:r>
-              <w:t>Controlador PLC Siemens S7-1200</w:t>
+              <w:t>{{ i.descripcion }}</w:t>
             </w:r>
-            <w:r/>
           </w:p>
         </w:tc>
         <w:tc>
           <w:tcPr>
-            <w:tcW w:type="dxa" w:w="1728"/>
+            <w:tcW w:type="dxa" w:w="1440"/>
+          </w:tcPr>
+          <w:p>
+            <w:r>
+              <w:t>{{ i.cantidad }}</w:t>
+            </w:r>
+          </w:p>
+        </w:tc>
+        <w:tc>
+          <w:tcPr>
+            <w:tcW w:type="dxa" w:w="1440"/>
+          </w:tcPr>
+          <w:p>
+            <w:r>
+              <w:t>{{ i.unidad }}</w:t>
+            </w:r>
+          </w:p>
+        </w:tc>
+        <w:tc>
+          <w:tcPr>
+            <w:tcW w:type="dxa" w:w="1440"/>
+          </w:tcPr>
+          <w:p>
+            <w:r>
+              <w:t>{{ i.precio_unitario }}</w:t>
+            </w:r>
+          </w:p>
+        </w:tc>
+        <w:tc>
+          <w:tcPr>
+            <w:tcW w:type="dxa" w:w="1440"/>
+          </w:tcPr>
+          <w:p>
+            <w:r>
+              <w:t>{{ i.total }}{% endfor %}</w:t>
+            </w:r>
+          </w:p>
+        </w:tc>
+      </w:tr>
+    </w:tbl>
+    <w:p>
+      <w:r>
+        <w:br/>
+      </w:r>
+    </w:p>
+    <w:p>
+      <w:pPr>
+        <w:jc w:val="right"/>
+      </w:pPr>
+      <w:r>
+        <w:t>SUBTOTAL: {{ SUBTOTAL }}</w:t>
+        <w:br/>
+      </w:r>
+      <w:r>
+        <w:t>IGV: {{ IGV }}</w:t>
+        <w:br/>
+      </w:r>
+      <w:r>
+        <w:rPr>
+          <w:b/>
+        </w:rPr>
+        <w:t>TOTAL: {{ TOTAL }}</w:t>
+      </w:r>
+    </w:p>
+    <w:p>
+      <w:r>
+        <w:rPr>
+          <w:b/>
+          <w:color w:val="0052A3"/>
+          <w:sz w:val="28"/>
+        </w:rPr>
+        <w:t>CAPÍTULO 1: Detalle de la Cotización</w:t>
+      </w:r>
+    </w:p>
+    <w:tbl>
+      <w:tblPr>
+        <w:tblStyle w:val="TableGrid"/>
+        <w:tblW w:type="auto" w:w="0"/>
+        <w:tblLook w:firstColumn="1" w:firstRow="1" w:lastColumn="0" w:lastRow="0" w:noHBand="0" w:noVBand="1" w:val="04A0"/>
+      </w:tblPr>
+      <w:tblGrid>
+        <w:gridCol w:w="1440"/>
+        <w:gridCol w:w="1440"/>
+        <w:gridCol w:w="1440"/>
+        <w:gridCol w:w="1440"/>
+        <w:gridCol w:w="1440"/>
+        <w:gridCol w:w="1440"/>
+      </w:tblGrid>
+      <w:tr>
+        <w:tc>
+          <w:tcPr>
+            <w:tcW w:type="dxa" w:w="1440"/>
+            <w:shd w:fill="0052A3"/>
+          </w:tcPr>
+          <w:p>
+            <w:pPr>
+              <w:jc w:val="center"/>
+            </w:pPr>
+            <w:r>
+              <w:rPr>
+                <w:b/>
+                <w:color w:val="FFFFFF"/>
+              </w:rPr>
+              <w:t>ITEM</w:t>
+            </w:r>
+          </w:p>
+        </w:tc>
+        <w:tc>
+          <w:tcPr>
+            <w:tcW w:type="dxa" w:w="1440"/>
+            <w:shd w:fill="0052A3"/>
+          </w:tcPr>
+          <w:p>
+            <w:pPr>
+              <w:jc w:val="center"/>
+            </w:pPr>
+            <w:r>
+              <w:rPr>
+                <w:b/>
+                <w:color w:val="FFFFFF"/>
+              </w:rPr>
+              <w:t>DESCRIPCIÓN</w:t>
+            </w:r>
+          </w:p>
+        </w:tc>
+        <w:tc>
+          <w:tcPr>
+            <w:tcW w:type="dxa" w:w="1440"/>
+            <w:shd w:fill="0052A3"/>
+          </w:tcPr>
+          <w:p>
+            <w:pPr>
+              <w:jc w:val="center"/>
+            </w:pPr>
+            <w:r>
+              <w:rPr>
+                <w:b/>
+                <w:color w:val="FFFFFF"/>
+              </w:rPr>
+              <w:t>CANT.</w:t>
+            </w:r>
+          </w:p>
+        </w:tc>
+        <w:tc>
+          <w:tcPr>
+            <w:tcW w:type="dxa" w:w="1440"/>
+            <w:shd w:fill="0052A3"/>
+          </w:tcPr>
+          <w:p>
+            <w:pPr>
+              <w:jc w:val="center"/>
+            </w:pPr>
+            <w:r>
+              <w:rPr>
+                <w:b/>
+                <w:color w:val="FFFFFF"/>
+              </w:rPr>
+              <w:t>UNIDAD</w:t>
+            </w:r>
+          </w:p>
+        </w:tc>
+        <w:tc>
+          <w:tcPr>
+            <w:tcW w:type="dxa" w:w="1440"/>
+            <w:shd w:fill="0052A3"/>
+          </w:tcPr>
+          <w:p>
+            <w:pPr>
+              <w:jc w:val="center"/>
+            </w:pPr>
+            <w:r>
+              <w:rPr>
+                <w:b/>
+                <w:color w:val="FFFFFF"/>
+              </w:rPr>
+              <w:t>P. UNIT.</w:t>
+            </w:r>
+          </w:p>
+        </w:tc>
+        <w:tc>
+          <w:tcPr>
+            <w:tcW w:type="dxa" w:w="1440"/>
+            <w:shd w:fill="0052A3"/>
+          </w:tcPr>
+          <w:p>
+            <w:pPr>
+              <w:jc w:val="center"/>
+            </w:pPr>
+            <w:r>
+              <w:rPr>
+                <w:b/>
+                <w:color w:val="FFFFFF"/>
+              </w:rPr>
+              <w:t>TOTAL</w:t>
+            </w:r>
+          </w:p>
+        </w:tc>
+      </w:tr>
+      <w:tr>
+        <w:tc>
+          <w:tcPr>
+            <w:tcW w:type="dxa" w:w="1440"/>
           </w:tcPr>
           <w:p>
             <w:r>
@@ -427,7 +337,27 @@
         </w:tc>
         <w:tc>
           <w:tcPr>
-            <w:tcW w:type="dxa" w:w="1728"/>
+            <w:tcW w:type="dxa" w:w="1440"/>
+          </w:tcPr>
+          <w:p>
+            <w:r>
+              <w:t>Controlador PLC Siemens S7-1200</w:t>
+            </w:r>
+          </w:p>
+        </w:tc>
+        <w:tc>
+          <w:tcPr>
+            <w:tcW w:type="dxa" w:w="1440"/>
+          </w:tcPr>
+          <w:p>
+            <w:r>
+              <w:t>1.0</w:t>
+            </w:r>
+          </w:p>
+        </w:tc>
+        <w:tc>
+          <w:tcPr>
+            <w:tcW w:type="dxa" w:w="1440"/>
           </w:tcPr>
           <w:p>
             <w:r>
@@ -437,11 +367,21 @@
         </w:tc>
         <w:tc>
           <w:tcPr>
-            <w:tcW w:type="dxa" w:w="1728"/>
+            <w:tcW w:type="dxa" w:w="1440"/>
           </w:tcPr>
           <w:p>
             <w:r>
-              <w:t>S/ 1,250.00</w:t>
+              <w:t>S/ 1250.00</w:t>
+            </w:r>
+          </w:p>
+        </w:tc>
+        <w:tc>
+          <w:tcPr>
+            <w:tcW w:type="dxa" w:w="1440"/>
+          </w:tcPr>
+          <w:p>
+            <w:r>
+              <w:t>S/ 1250.00</w:t>
             </w:r>
           </w:p>
         </w:tc>
@@ -449,39 +389,37 @@
       <w:tr>
         <w:tc>
           <w:tcPr>
-            <w:tcW w:type="dxa" w:w="1728"/>
+            <w:tcW w:type="dxa" w:w="1440"/>
           </w:tcPr>
           <w:p>
             <w:r>
-              <w:t>02</w:t>
+              <w:t>2</w:t>
             </w:r>
           </w:p>
         </w:tc>
         <w:tc>
           <w:tcPr>
-            <w:tcW w:type="dxa" w:w="1728"/>
-          </w:tcPr>
-          <w:p>
-            <w:r/>
-            <w:r>
-              <w:t>Licencia TIA Portal V17 Premium</w:t>
-            </w:r>
-            <w:r/>
-          </w:p>
-        </w:tc>
-        <w:tc>
-          <w:tcPr>
-            <w:tcW w:type="dxa" w:w="1728"/>
+            <w:tcW w:type="dxa" w:w="1440"/>
           </w:tcPr>
           <w:p>
             <w:r>
-              <w:t>1</w:t>
+              <w:t>Licencia TIA Portal V17 Premium</w:t>
             </w:r>
           </w:p>
         </w:tc>
         <w:tc>
           <w:tcPr>
-            <w:tcW w:type="dxa" w:w="1728"/>
+            <w:tcW w:type="dxa" w:w="1440"/>
+          </w:tcPr>
+          <w:p>
+            <w:r>
+              <w:t>1.0</w:t>
+            </w:r>
+          </w:p>
+        </w:tc>
+        <w:tc>
+          <w:tcPr>
+            <w:tcW w:type="dxa" w:w="1440"/>
           </w:tcPr>
           <w:p>
             <w:r>
@@ -491,7 +429,17 @@
         </w:tc>
         <w:tc>
           <w:tcPr>
-            <w:tcW w:type="dxa" w:w="1728"/>
+            <w:tcW w:type="dxa" w:w="1440"/>
+          </w:tcPr>
+          <w:p>
+            <w:r>
+              <w:t>S/ 800.00</w:t>
+            </w:r>
+          </w:p>
+        </w:tc>
+        <w:tc>
+          <w:tcPr>
+            <w:tcW w:type="dxa" w:w="1440"/>
           </w:tcPr>
           <w:p>
             <w:r>
@@ -503,39 +451,37 @@
       <w:tr>
         <w:tc>
           <w:tcPr>
-            <w:tcW w:type="dxa" w:w="1728"/>
+            <w:tcW w:type="dxa" w:w="1440"/>
           </w:tcPr>
           <w:p>
             <w:r>
-              <w:t>03</w:t>
+              <w:t>3</w:t>
             </w:r>
           </w:p>
         </w:tc>
         <w:tc>
           <w:tcPr>
-            <w:tcW w:type="dxa" w:w="1728"/>
-          </w:tcPr>
-          <w:p>
-            <w:r/>
-            <w:r>
-              <w:t>Instalación y Configuración en Planta</w:t>
-            </w:r>
-            <w:r/>
-          </w:p>
-        </w:tc>
-        <w:tc>
-          <w:tcPr>
-            <w:tcW w:type="dxa" w:w="1728"/>
+            <w:tcW w:type="dxa" w:w="1440"/>
           </w:tcPr>
           <w:p>
             <w:r>
-              <w:t>1</w:t>
+              <w:t>Instalación y Configuración en Planta</w:t>
             </w:r>
           </w:p>
         </w:tc>
         <w:tc>
           <w:tcPr>
-            <w:tcW w:type="dxa" w:w="1728"/>
+            <w:tcW w:type="dxa" w:w="1440"/>
+          </w:tcPr>
+          <w:p>
+            <w:r>
+              <w:t>1.0</w:t>
+            </w:r>
+          </w:p>
+        </w:tc>
+        <w:tc>
+          <w:tcPr>
+            <w:tcW w:type="dxa" w:w="1440"/>
           </w:tcPr>
           <w:p>
             <w:r>
@@ -545,23 +491,53 @@
         </w:tc>
         <w:tc>
           <w:tcPr>
-            <w:tcW w:type="dxa" w:w="1728"/>
+            <w:tcW w:type="dxa" w:w="1440"/>
           </w:tcPr>
           <w:p>
             <w:r>
-              <w:t>S/ 2,500.00</w:t>
+              <w:t>S/ 2500.00</w:t>
+            </w:r>
+          </w:p>
+        </w:tc>
+        <w:tc>
+          <w:tcPr>
+            <w:tcW w:type="dxa" w:w="1440"/>
+          </w:tcPr>
+          <w:p>
+            <w:r>
+              <w:t>S/ 2500.00</w:t>
             </w:r>
           </w:p>
         </w:tc>
       </w:tr>
     </w:tbl>
     <w:p>
-      <w:r/>
-      <w:r/>
-      <w:r/>
+      <w:pPr>
+        <w:jc w:val="right"/>
+      </w:pPr>
+      <w:r>
+        <w:rPr>
+          <w:b/>
+          <w:color w:val="1E40AF"/>
+          <w:sz w:val="24"/>
+        </w:rPr>
+        <w:t>Subtotal Capítulo 1: S/ 4550.00</w:t>
+      </w:r>
+    </w:p>
+    <w:p/>
+    <w:p>
+      <w:r>
+        <w:rPr>
+          <w:b/>
+          <w:color w:val="0052A3"/>
+          <w:sz w:val="28"/>
+        </w:rPr>
+        <w:t>RESUMEN DE COSTOS</w:t>
+      </w:r>
     </w:p>
     <w:tbl>
       <w:tblPr>
+        <w:tblStyle w:val="TableGrid"/>
         <w:tblW w:type="auto" w:w="0"/>
         <w:tblLook w:firstColumn="1" w:firstRow="1" w:lastColumn="0" w:lastRow="0" w:noHBand="0" w:noVBand="1" w:val="04A0"/>
       </w:tblPr>
@@ -576,10 +552,7 @@
           </w:tcPr>
           <w:p>
             <w:r>
-              <w:rPr>
-                <w:b/>
-              </w:rPr>
-              <w:t>Subtotal:</w:t>
+              <w:t>SUBTOTAL:</w:t>
             </w:r>
           </w:p>
         </w:tc>
@@ -589,7 +562,7 @@
           </w:tcPr>
           <w:p>
             <w:r>
-              <w:t>S/ 4,550.00</w:t>
+              <w:t>S/ 4550.00</w:t>
             </w:r>
           </w:p>
         </w:tc>
@@ -601,9 +574,6 @@
           </w:tcPr>
           <w:p>
             <w:r>
-              <w:rPr>
-                <w:b/>
-              </w:rPr>
               <w:t>IGV (18%):</w:t>
             </w:r>
           </w:p>
@@ -623,13 +593,110 @@
         <w:tc>
           <w:tcPr>
             <w:tcW w:type="dxa" w:w="4320"/>
+            <w:shd w:fill="0052A3"/>
           </w:tcPr>
           <w:p>
             <w:r>
               <w:rPr>
                 <w:b/>
+                <w:color w:val="FFFFFF"/>
+                <w:sz w:val="28"/>
               </w:rPr>
               <w:t>TOTAL:</w:t>
+            </w:r>
+          </w:p>
+        </w:tc>
+        <w:tc>
+          <w:tcPr>
+            <w:tcW w:type="dxa" w:w="4320"/>
+            <w:shd w:fill="0052A3"/>
+          </w:tcPr>
+          <w:p>
+            <w:r>
+              <w:rPr>
+                <w:b/>
+                <w:color w:val="FFFFFF"/>
+                <w:sz w:val="28"/>
+              </w:rPr>
+              <w:t>S/ 5369.00</w:t>
+            </w:r>
+          </w:p>
+        </w:tc>
+      </w:tr>
+    </w:tbl>
+    <w:p/>
+    <w:p>
+      <w:pPr>
+        <w:jc w:val="center"/>
+      </w:pPr>
+      <w:r>
+        <w:rPr>
+          <w:b/>
+          <w:color w:val="0052A3"/>
+          <w:sz w:val="36"/>
+        </w:rPr>
+        <w:t>COTIZACIÓN DE SERVICIOS</w:t>
+      </w:r>
+    </w:p>
+    <w:p>
+      <w:pPr>
+        <w:jc w:val="center"/>
+      </w:pPr>
+      <w:r>
+        <w:rPr>
+          <w:color w:val="1E40AF"/>
+          <w:sz w:val="28"/>
+        </w:rPr>
+        <w:t>N° DOC-TU EMPRESA S.A.C.-1</w:t>
+      </w:r>
+    </w:p>
+    <w:p/>
+    <w:tbl>
+      <w:tblPr>
+        <w:tblW w:type="auto" w:w="0"/>
+        <w:tblLook w:firstColumn="1" w:firstRow="1" w:lastColumn="0" w:lastRow="0" w:noHBand="0" w:noVBand="1" w:val="04A0"/>
+      </w:tblPr>
+      <w:tblGrid>
+        <w:gridCol w:w="4320"/>
+        <w:gridCol w:w="4320"/>
+      </w:tblGrid>
+      <w:tr>
+        <w:tc>
+          <w:tcPr>
+            <w:tcW w:type="dxa" w:w="4320"/>
+          </w:tcPr>
+          <w:p>
+            <w:r>
+              <w:rPr>
+                <w:b/>
+                <w:color w:val="0052A3"/>
+                <w:sz w:val="22"/>
+              </w:rPr>
+              <w:t>DATOS DEL CLIENTE</w:t>
+            </w:r>
+          </w:p>
+          <w:p>
+            <w:r>
+              <w:rPr>
+                <w:sz w:val="20"/>
+              </w:rPr>
+              <w:t>Cliente: INDUSTRIAL SOLUTIONS PERÚ S.A.</w:t>
+            </w:r>
+          </w:p>
+          <w:p>
+            <w:r>
+              <w:rPr>
+                <w:sz w:val="20"/>
+              </w:rPr>
+              <w:t>Proyecto: Proyecto Serv.1</w:t>
+            </w:r>
+          </w:p>
+          <w:p>
+            <w:r>
+              <w:rPr>
+                <w:sz w:val="20"/>
+              </w:rPr>
+              <w:t>Área: 0 m²</w:t>
             </w:r>
           </w:p>
         </w:tc>
@@ -639,139 +706,630 @@
           </w:tcPr>
           <w:p>
             <w:r>
-              <w:t>S/ 5,369.00</w:t>
+              <w:rPr>
+                <w:b/>
+                <w:color w:val="0052A3"/>
+                <w:sz w:val="22"/>
+              </w:rPr>
+              <w:t>DATOS DE LA COTIZACIÓN</w:t>
+            </w:r>
+          </w:p>
+          <w:p>
+            <w:r>
+              <w:rPr>
+                <w:sz w:val="20"/>
+              </w:rPr>
+              <w:t>Fecha: N° N04-SOL-2026-045 | Fecha: 25/03/2026</w:t>
+            </w:r>
+          </w:p>
+          <w:p>
+            <w:r>
+              <w:rPr>
+                <w:sz w:val="20"/>
+              </w:rPr>
+              <w:t>Vigencia: 30 días</w:t>
+            </w:r>
+          </w:p>
+          <w:p>
+            <w:r>
+              <w:rPr>
+                <w:sz w:val="20"/>
+              </w:rPr>
+              <w:t>Servicio: Servicios Eléctricos</w:t>
             </w:r>
           </w:p>
         </w:tc>
       </w:tr>
     </w:tbl>
+    <w:p/>
     <w:p>
-      <w:r/>
-      <w:r/>
-      <w:r/>
+      <w:r>
+        <w:rPr>
+          <w:b/>
+          <w:color w:val="0052A3"/>
+          <w:sz w:val="32"/>
+        </w:rPr>
+        <w:t>ALCANCE DEL PROYECTO</w:t>
+      </w:r>
+    </w:p>
+    <w:p>
+      <w:r>
+        <w:rPr>
+          <w:color w:val="374151"/>
+          <w:sz w:val="22"/>
+        </w:rPr>
+        <w:t>Descripción detallada del proyecto...</w:t>
+      </w:r>
+    </w:p>
+    <w:p>
+      <w:r>
+        <w:rPr>
+          <w:b/>
+          <w:color w:val="0052A3"/>
+          <w:sz w:val="22"/>
+        </w:rPr>
+        <w:t>INCLUYE:</w:t>
+      </w:r>
     </w:p>
     <w:p>
       <w:pPr>
-        <w:pStyle w:val="Heading2"/>
+        <w:ind w:left="360"/>
       </w:pPr>
       <w:r>
-        <w:t>ENTREGABLES Y GARANTÍAS</w:t>
+        <w:rPr>
+          <w:color w:val="374151"/>
+          <w:sz w:val="20"/>
+        </w:rPr>
+        <w:t>✓ Ingeniería de detalle con cálculos según CNE - Código Nacional de Electricidad</w:t>
       </w:r>
-      <w:r/>
-      <w:r/>
     </w:p>
     <w:p>
       <w:pPr>
-        <w:pStyle w:val="ListBullet"/>
-        <w:spacing w:line="240" w:lineRule="auto"/>
-        <w:ind w:left="720"/>
+        <w:ind w:left="360"/>
       </w:pPr>
-      <w:r/>
       <w:r>
-        <w:t>Planos Eléctricos en AutoCAD v2026</w:t>
+        <w:rPr>
+          <w:color w:val="374151"/>
+          <w:sz w:val="20"/>
+        </w:rPr>
+        <w:t>✓ Suministro de materiales de primera calidad</w:t>
       </w:r>
-      <w:r/>
     </w:p>
     <w:p>
       <w:pPr>
-        <w:pStyle w:val="ListBullet"/>
-        <w:spacing w:line="240" w:lineRule="auto"/>
-        <w:ind w:left="720"/>
+        <w:ind w:left="360"/>
       </w:pPr>
-      <w:r/>
       <w:r>
-        <w:t>Manuales de Operación y Mantenimiento</w:t>
+        <w:rPr>
+          <w:color w:val="374151"/>
+          <w:sz w:val="20"/>
+        </w:rPr>
+        <w:t>✓ Instalación por personal técnico certificado</w:t>
       </w:r>
-      <w:r/>
     </w:p>
     <w:p>
       <w:pPr>
-        <w:pStyle w:val="ListBullet"/>
-        <w:spacing w:line="240" w:lineRule="auto"/>
-        <w:ind w:left="720"/>
+        <w:ind w:left="360"/>
       </w:pPr>
-      <w:r/>
       <w:r>
-        <w:t>Protocolos de Pruebas de Funcionamiento (FAT/SAT)</w:t>
+        <w:rPr>
+          <w:color w:val="374151"/>
+          <w:sz w:val="20"/>
+        </w:rPr>
+        <w:t>✓ Pruebas y puesta en marcha</w:t>
       </w:r>
-      <w:r/>
     </w:p>
     <w:p>
       <w:pPr>
-        <w:pStyle w:val="ListBullet"/>
-        <w:spacing w:line="240" w:lineRule="auto"/>
-        <w:ind w:left="720"/>
+        <w:ind w:left="360"/>
       </w:pPr>
-      <w:r/>
       <w:r>
-        <w:t>Garantía técnica de 12 meses contra defectos de fábrica.</w:t>
+        <w:rPr>
+          <w:color w:val="374151"/>
+          <w:sz w:val="20"/>
+        </w:rPr>
+        <w:t>✓ Documentación técnica completa</w:t>
       </w:r>
-      <w:r/>
     </w:p>
     <w:p>
       <w:pPr>
-        <w:pStyle w:val="ListBullet"/>
-        <w:spacing w:line="240" w:lineRule="auto"/>
-        <w:ind w:left="720"/>
-        <w:jc w:val="right"/>
+        <w:ind w:left="360"/>
       </w:pPr>
-      <w:r/>
       <w:r>
-        <w:t>Soporte técnico preferencial durante los primeros 90 días.</w:t>
+        <w:rPr>
+          <w:color w:val="374151"/>
+          <w:sz w:val="20"/>
+        </w:rPr>
+        <w:t>✓ Garantía de 12 meses</w:t>
       </w:r>
-      <w:r/>
-      <w:r/>
-      <w:r/>
-      <w:r/>
-      <w:r/>
+    </w:p>
+    <w:p/>
+    <w:p>
       <w:r>
         <w:rPr>
           <w:b/>
+          <w:color w:val="0052A3"/>
+          <w:sz w:val="32"/>
         </w:rPr>
-        <w:t>TU EMPRESA S.A.C.</w:t>
-        <w:br/>
+        <w:t>CRONOGRAMA ESTIMADO</w:t>
       </w:r>
-      <w:r>
-        <w:t>RUC: 20123456789 | Av. Tecnología 123, Lima</w:t>
-      </w:r>
-      <w:r/>
-      <w:r>
-        <w:t>Aceptado por: _________________________</w:t>
-        <w:br/>
-      </w:r>
-      <w:r>
-        <w:t>Fecha: ____/____/2026</w:t>
-      </w:r>
-      <w:r/>
-      <w:r/>
-      <w:r/>
-      <w:r/>
-      <w:r/>
-      <w:r/>
+    </w:p>
+    <w:tbl>
+      <w:tblPr>
+        <w:tblStyle w:val="TableGrid"/>
+        <w:tblW w:type="auto" w:w="0"/>
+        <w:tblLook w:firstColumn="1" w:firstRow="1" w:lastColumn="0" w:lastRow="0" w:noHBand="0" w:noVBand="1" w:val="04A0"/>
+      </w:tblPr>
+      <w:tblGrid>
+        <w:gridCol w:w="2160"/>
+        <w:gridCol w:w="2160"/>
+        <w:gridCol w:w="2160"/>
+        <w:gridCol w:w="2160"/>
+      </w:tblGrid>
+      <w:tr>
+        <w:tc>
+          <w:tcPr>
+            <w:tcW w:type="dxa" w:w="2160"/>
+            <w:shd w:fill="0052A3"/>
+          </w:tcPr>
+          <w:p>
+            <w:pPr>
+              <w:jc w:val="center"/>
+            </w:pPr>
+            <w:r>
+              <w:rPr>
+                <w:b/>
+                <w:color w:val="FFFFFF"/>
+                <w:sz w:val="36"/>
+              </w:rPr>
+              <w:t>1</w:t>
+            </w:r>
+          </w:p>
+        </w:tc>
+        <w:tc>
+          <w:tcPr>
+            <w:tcW w:type="dxa" w:w="2160"/>
+            <w:shd w:fill="0052A3"/>
+          </w:tcPr>
+          <w:p>
+            <w:pPr>
+              <w:jc w:val="center"/>
+            </w:pPr>
+            <w:r>
+              <w:rPr>
+                <w:b/>
+                <w:color w:val="FFFFFF"/>
+                <w:sz w:val="36"/>
+              </w:rPr>
+              <w:t>2</w:t>
+            </w:r>
+          </w:p>
+        </w:tc>
+        <w:tc>
+          <w:tcPr>
+            <w:tcW w:type="dxa" w:w="2160"/>
+            <w:shd w:fill="0052A3"/>
+          </w:tcPr>
+          <w:p>
+            <w:pPr>
+              <w:jc w:val="center"/>
+            </w:pPr>
+            <w:r>
+              <w:rPr>
+                <w:b/>
+                <w:color w:val="FFFFFF"/>
+                <w:sz w:val="36"/>
+              </w:rPr>
+              <w:t>3</w:t>
+            </w:r>
+          </w:p>
+        </w:tc>
+        <w:tc>
+          <w:tcPr>
+            <w:tcW w:type="dxa" w:w="2160"/>
+            <w:shd w:fill="0052A3"/>
+          </w:tcPr>
+          <w:p>
+            <w:pPr>
+              <w:jc w:val="center"/>
+            </w:pPr>
+            <w:r>
+              <w:rPr>
+                <w:b/>
+                <w:color w:val="FFFFFF"/>
+                <w:sz w:val="36"/>
+              </w:rPr>
+              <w:t>4</w:t>
+            </w:r>
+          </w:p>
+        </w:tc>
+      </w:tr>
+      <w:tr>
+        <w:tc>
+          <w:tcPr>
+            <w:tcW w:type="dxa" w:w="2160"/>
+          </w:tcPr>
+          <w:p>
+            <w:r/>
+          </w:p>
+          <w:p>
+            <w:pPr>
+              <w:jc w:val="center"/>
+            </w:pPr>
+            <w:r>
+              <w:rPr>
+                <w:b/>
+                <w:color w:val="0052A3"/>
+                <w:sz w:val="22"/>
+              </w:rPr>
+              <w:t>Ingeniería</w:t>
+            </w:r>
+          </w:p>
+          <w:p>
+            <w:pPr>
+              <w:jc w:val="center"/>
+            </w:pPr>
+            <w:r>
+              <w:rPr>
+                <w:color w:val="6B7280"/>
+                <w:sz w:val="20"/>
+              </w:rPr>
+              <w:t>5 días</w:t>
+            </w:r>
+          </w:p>
+        </w:tc>
+        <w:tc>
+          <w:tcPr>
+            <w:tcW w:type="dxa" w:w="2160"/>
+          </w:tcPr>
+          <w:p>
+            <w:r/>
+          </w:p>
+          <w:p>
+            <w:pPr>
+              <w:jc w:val="center"/>
+            </w:pPr>
+            <w:r>
+              <w:rPr>
+                <w:b/>
+                <w:color w:val="0052A3"/>
+                <w:sz w:val="22"/>
+              </w:rPr>
+              <w:t>Adquisiciones</w:t>
+            </w:r>
+          </w:p>
+          <w:p>
+            <w:pPr>
+              <w:jc w:val="center"/>
+            </w:pPr>
+            <w:r>
+              <w:rPr>
+                <w:color w:val="6B7280"/>
+                <w:sz w:val="20"/>
+              </w:rPr>
+              <w:t>7 días</w:t>
+            </w:r>
+          </w:p>
+        </w:tc>
+        <w:tc>
+          <w:tcPr>
+            <w:tcW w:type="dxa" w:w="2160"/>
+          </w:tcPr>
+          <w:p>
+            <w:r/>
+          </w:p>
+          <w:p>
+            <w:pPr>
+              <w:jc w:val="center"/>
+            </w:pPr>
+            <w:r>
+              <w:rPr>
+                <w:b/>
+                <w:color w:val="0052A3"/>
+                <w:sz w:val="22"/>
+              </w:rPr>
+              <w:t>Instalación</w:t>
+            </w:r>
+          </w:p>
+          <w:p>
+            <w:pPr>
+              <w:jc w:val="center"/>
+            </w:pPr>
+            <w:r>
+              <w:rPr>
+                <w:color w:val="6B7280"/>
+                <w:sz w:val="20"/>
+              </w:rPr>
+              <w:t>10 días</w:t>
+            </w:r>
+          </w:p>
+        </w:tc>
+        <w:tc>
+          <w:tcPr>
+            <w:tcW w:type="dxa" w:w="2160"/>
+          </w:tcPr>
+          <w:p>
+            <w:r/>
+          </w:p>
+          <w:p>
+            <w:pPr>
+              <w:jc w:val="center"/>
+            </w:pPr>
+            <w:r>
+              <w:rPr>
+                <w:b/>
+                <w:color w:val="0052A3"/>
+                <w:sz w:val="22"/>
+              </w:rPr>
+              <w:t>Pruebas</w:t>
+            </w:r>
+          </w:p>
+          <w:p>
+            <w:pPr>
+              <w:jc w:val="center"/>
+            </w:pPr>
+            <w:r>
+              <w:rPr>
+                <w:color w:val="6B7280"/>
+                <w:sz w:val="20"/>
+              </w:rPr>
+              <w:t>3 días</w:t>
+            </w:r>
+          </w:p>
+        </w:tc>
+      </w:tr>
+    </w:tbl>
+    <w:p/>
+    <w:p>
       <w:r>
         <w:rPr>
           <w:b/>
+          <w:color w:val="0052A3"/>
+          <w:sz w:val="32"/>
         </w:rPr>
-        <w:t>TU EMPRESA S.A.C.</w:t>
-        <w:br/>
+        <w:t>GARANTÍAS INCLUIDAS</w:t>
       </w:r>
+    </w:p>
+    <w:tbl>
+      <w:tblPr>
+        <w:tblStyle w:val="TableGrid"/>
+        <w:tblW w:type="auto" w:w="0"/>
+        <w:tblLook w:firstColumn="1" w:firstRow="1" w:lastColumn="0" w:lastRow="0" w:noHBand="0" w:noVBand="1" w:val="04A0"/>
+      </w:tblPr>
+      <w:tblGrid>
+        <w:gridCol w:w="2880"/>
+        <w:gridCol w:w="2880"/>
+        <w:gridCol w:w="2880"/>
+      </w:tblGrid>
+      <w:tr>
+        <w:tc>
+          <w:tcPr>
+            <w:tcW w:type="dxa" w:w="2880"/>
+            <w:shd w:fill="F9FAFB"/>
+          </w:tcPr>
+          <w:p>
+            <w:pPr>
+              <w:jc w:val="center"/>
+            </w:pPr>
+            <w:r>
+              <w:rPr>
+                <w:b/>
+                <w:color w:val="374151"/>
+                <w:sz w:val="22"/>
+              </w:rPr>
+              <w:t>🛠️ 12 meses en mano de obra</w:t>
+            </w:r>
+          </w:p>
+        </w:tc>
+        <w:tc>
+          <w:tcPr>
+            <w:tcW w:type="dxa" w:w="2880"/>
+            <w:shd w:fill="F9FAFB"/>
+          </w:tcPr>
+          <w:p>
+            <w:pPr>
+              <w:jc w:val="center"/>
+            </w:pPr>
+            <w:r>
+              <w:rPr>
+                <w:b/>
+                <w:color w:val="374151"/>
+                <w:sz w:val="22"/>
+              </w:rPr>
+              <w:t>⚙️ Garantía de fabricante en equipos</w:t>
+            </w:r>
+          </w:p>
+        </w:tc>
+        <w:tc>
+          <w:tcPr>
+            <w:tcW w:type="dxa" w:w="2880"/>
+            <w:shd w:fill="F9FAFB"/>
+          </w:tcPr>
+          <w:p>
+            <w:pPr>
+              <w:jc w:val="center"/>
+            </w:pPr>
+            <w:r>
+              <w:rPr>
+                <w:b/>
+                <w:color w:val="374151"/>
+                <w:sz w:val="22"/>
+              </w:rPr>
+              <w:t>💬 Soporte técnico por 6 meses</w:t>
+            </w:r>
+          </w:p>
+        </w:tc>
+      </w:tr>
+    </w:tbl>
+    <w:p/>
+    <w:p>
       <w:r>
-        <w:t>Generado automáticamente - Sistema PILi Quarts</w:t>
+        <w:rPr>
+          <w:b/>
+          <w:color w:val="0052A3"/>
+          <w:sz w:val="32"/>
+        </w:rPr>
+        <w:t>CONDICIONES DE PAGO</w:t>
       </w:r>
-      <w:r/>
+    </w:p>
+    <w:p>
+      <w:pPr>
+        <w:ind w:left="360"/>
+      </w:pPr>
       <w:r>
-        <w:t>Aceptado por: _________________________</w:t>
-        <w:br/>
+        <w:rPr>
+          <w:color w:val="374151"/>
+          <w:sz w:val="20"/>
+        </w:rPr>
+        <w:t>✓ 50% de adelanto a la firma del contrato</w:t>
       </w:r>
+    </w:p>
+    <w:p>
+      <w:pPr>
+        <w:ind w:left="360"/>
+      </w:pPr>
       <w:r>
-        <w:t>Fecha de Aceptación: ____/____/2026</w:t>
+        <w:rPr>
+          <w:color w:val="374151"/>
+          <w:sz w:val="20"/>
+        </w:rPr>
+        <w:t>✓ 30% al 50% de avance de obra</w:t>
       </w:r>
-      <w:r/>
-      <w:r/>
-      <w:r/>
-      <w:r/>
+    </w:p>
+    <w:p>
+      <w:pPr>
+        <w:ind w:left="360"/>
+      </w:pPr>
+      <w:r>
+        <w:rPr>
+          <w:color w:val="374151"/>
+          <w:sz w:val="20"/>
+        </w:rPr>
+        <w:t>✓ 20% contra entrega y conformidad</w:t>
+      </w:r>
+    </w:p>
+    <w:p/>
+    <w:p>
+      <w:r>
+        <w:rPr>
+          <w:b/>
+          <w:color w:val="0052A3"/>
+          <w:sz w:val="32"/>
+        </w:rPr>
+        <w:t>OBSERVACIONES TÉCNICAS</w:t>
+      </w:r>
+    </w:p>
+    <w:p>
+      <w:pPr>
+        <w:ind w:left="360"/>
+      </w:pPr>
+      <w:r>
+        <w:rPr>
+          <w:color w:val="374151"/>
+          <w:sz w:val="20"/>
+        </w:rPr>
+        <w:t>✓ Trabajos ejecutados según CNE - Código Nacional de Electricidad</w:t>
+      </w:r>
+    </w:p>
+    <w:p>
+      <w:pPr>
+        <w:ind w:left="360"/>
+      </w:pPr>
+      <w:r>
+        <w:rPr>
+          <w:color w:val="374151"/>
+          <w:sz w:val="20"/>
+        </w:rPr>
+        <w:t>✓ Materiales de primera calidad con certificación internacional</w:t>
+      </w:r>
+    </w:p>
+    <w:p>
+      <w:pPr>
+        <w:ind w:left="360"/>
+      </w:pPr>
+      <w:r>
+        <w:rPr>
+          <w:color w:val="374151"/>
+          <w:sz w:val="20"/>
+        </w:rPr>
+        <w:t>✓ Mano de obra especializada y certificada</w:t>
+      </w:r>
+    </w:p>
+    <w:p>
+      <w:pPr>
+        <w:ind w:left="360"/>
+      </w:pPr>
+      <w:r>
+        <w:rPr>
+          <w:color w:val="374151"/>
+          <w:sz w:val="20"/>
+        </w:rPr>
+        <w:t>✓ Incluye transporte de materiales</w:t>
+      </w:r>
+    </w:p>
+    <w:p>
+      <w:pPr>
+        <w:ind w:left="360"/>
+      </w:pPr>
+      <w:r>
+        <w:rPr>
+          <w:color w:val="374151"/>
+          <w:sz w:val="20"/>
+        </w:rPr>
+        <w:t>✓ Pruebas y puesta en marcha incluidas</w:t>
+      </w:r>
+    </w:p>
+    <w:p>
+      <w:pPr>
+        <w:ind w:left="360"/>
+      </w:pPr>
+      <w:r>
+        <w:rPr>
+          <w:color w:val="374151"/>
+          <w:sz w:val="20"/>
+        </w:rPr>
+        <w:t>✓ Capacitación al personal del cliente</w:t>
+      </w:r>
+    </w:p>
+    <w:p>
+      <w:pPr>
+        <w:ind w:left="360"/>
+      </w:pPr>
+      <w:r>
+        <w:rPr>
+          <w:color w:val="374151"/>
+          <w:sz w:val="20"/>
+        </w:rPr>
+        <w:t>✓ Documentación técnica completa (planos as-built, protocolos, certificados)</w:t>
+      </w:r>
+    </w:p>
+    <w:p>
+      <w:pPr>
+        <w:ind w:left="360"/>
+      </w:pPr>
+      <w:r>
+        <w:rPr>
+          <w:color w:val="374151"/>
+          <w:sz w:val="20"/>
+        </w:rPr>
+        <w:t>✓ Precios en dólares americanos (USD)</w:t>
+      </w:r>
+    </w:p>
+    <w:p>
+      <w:pPr>
+        <w:ind w:left="360"/>
+      </w:pPr>
+      <w:r>
+        <w:rPr>
+          <w:color w:val="374151"/>
+          <w:sz w:val="20"/>
+        </w:rPr>
+        <w:t>✓ Cotización válida por 30 días</w:t>
+      </w:r>
     </w:p>
     <w:sectPr>
+      <w:headerReference w:type="default" r:id="rId9"/>
+      <w:footerReference w:type="default" r:id="rId10"/>
       <w:pgSz w:w="12240" w:h="15840"/>
       <w:pgMar w:top="1440" w:right="1800" w:bottom="1440" w:left="1800" w:header="720" w:footer="720" w:gutter="0"/>
       <w:cols w:space="720"/>
@@ -779,6 +1337,38 @@
     </w:sectPr>
   </w:body>
 </w:document>
+</file>
+
+<file path=word/footer1.xml><?xml version="1.0" encoding="utf-8"?>
+<w:ftr xmlns:m="http://schemas.openxmlformats.org/officeDocument/2006/math" xmlns:mc="http://schemas.openxmlformats.org/markup-compatibility/2006" xmlns:mo="http://schemas.microsoft.com/office/mac/office/2008/main" xmlns:mv="urn:schemas-microsoft-com:mac:vml" xmlns:o="urn:schemas-microsoft-com:office:office" xmlns:r="http://schemas.openxmlformats.org/officeDocument/2006/relationships" xmlns:v="urn:schemas-microsoft-com:vml" xmlns:w10="urn:schemas-microsoft-com:office:word" xmlns:w14="http://schemas.microsoft.com/office/word/2010/wordml" xmlns:w="http://schemas.openxmlformats.org/wordprocessingml/2006/main" xmlns:wne="http://schemas.microsoft.com/office/word/2006/wordml" xmlns:wp14="http://schemas.microsoft.com/office/word/2010/wordprocessingDrawing" xmlns:wp="http://schemas.openxmlformats.org/drawingml/2006/wordprocessingDrawing" xmlns:wpc="http://schemas.microsoft.com/office/word/2010/wordprocessingCanvas" xmlns:wpg="http://schemas.microsoft.com/office/word/2010/wordprocessingGroup" xmlns:wpi="http://schemas.microsoft.com/office/word/2010/wordprocessingInk" xmlns:wps="http://schemas.microsoft.com/office/word/2010/wordprocessingShape" mc:Ignorable="w14 wp14">
+  <w:p>
+    <w:pPr>
+      <w:pStyle w:val="Footer"/>
+      <w:jc w:val="center"/>
+    </w:pPr>
+    <w:r>
+      <w:t>Generado por Protocolo RALFTH Oro - Espejo Inmaculado</w:t>
+    </w:r>
+  </w:p>
+</w:ftr>
+</file>
+
+<file path=word/header1.xml><?xml version="1.0" encoding="utf-8"?>
+<w:hdr xmlns:m="http://schemas.openxmlformats.org/officeDocument/2006/math" xmlns:mc="http://schemas.openxmlformats.org/markup-compatibility/2006" xmlns:mo="http://schemas.microsoft.com/office/mac/office/2008/main" xmlns:mv="urn:schemas-microsoft-com:mac:vml" xmlns:o="urn:schemas-microsoft-com:office:office" xmlns:r="http://schemas.openxmlformats.org/officeDocument/2006/relationships" xmlns:v="urn:schemas-microsoft-com:vml" xmlns:w10="urn:schemas-microsoft-com:office:word" xmlns:w14="http://schemas.microsoft.com/office/word/2010/wordml" xmlns:w="http://schemas.openxmlformats.org/wordprocessingml/2006/main" xmlns:wne="http://schemas.microsoft.com/office/word/2006/wordml" xmlns:wp14="http://schemas.microsoft.com/office/word/2010/wordprocessingDrawing" xmlns:wp="http://schemas.openxmlformats.org/drawingml/2006/wordprocessingDrawing" xmlns:wpc="http://schemas.microsoft.com/office/word/2010/wordprocessingCanvas" xmlns:wpg="http://schemas.microsoft.com/office/word/2010/wordprocessingGroup" xmlns:wpi="http://schemas.microsoft.com/office/word/2010/wordprocessingInk" xmlns:wps="http://schemas.microsoft.com/office/word/2010/wordprocessingShape" mc:Ignorable="w14 wp14">
+  <w:p>
+    <w:pPr>
+      <w:pStyle w:val="Header"/>
+      <w:jc w:val="center"/>
+    </w:pPr>
+    <w:r>
+      <w:rPr>
+        <w:b/>
+        <w:color w:val="0052A3"/>
+      </w:rPr>
+      <w:t>N04 SOBERANA - DOCUMENTO DE ALTA FIDELIDAD</w:t>
+    </w:r>
+  </w:p>
+</w:hdr>
 </file>
 
 <file path=word/numbering.xml><?xml version="1.0" encoding="utf-8"?>
@@ -1181,6 +1771,9 @@
       </w:tabs>
       <w:spacing w:after="0" w:line="240" w:lineRule="auto"/>
     </w:pPr>
+    <w:rPr>
+      <w:sz w:val="16"/>
+    </w:rPr>
   </w:style>
   <w:style w:type="character" w:customStyle="1" w:styleId="FooterChar">
     <w:name w:val="Footer Char"/>

</xml_diff>